<commit_message>
fix(export): align docx footer layout, styling, and page numbering with pdf footer
</commit_message>
<xml_diff>
--- a/backend/app/templates/GBF_ANTET_TEMPLATE.docx
+++ b/backend/app/templates/GBF_ANTET_TEMPLATE.docx
@@ -537,516 +537,372 @@
 </file>
 
 <file path=word/footer1.xml><?xml version="1.0" encoding="utf-8"?>
-<w:ftr xmlns:wpc="http://schemas.microsoft.com/office/word/2010/wordprocessingCanvas" xmlns:cx="http://schemas.microsoft.com/office/drawing/2014/chartex" xmlns:cx1="http://schemas.microsoft.com/office/drawing/2015/9/8/chartex" xmlns:cx2="http://schemas.microsoft.com/office/drawing/2015/10/21/chartex" xmlns:cx3="http://schemas.microsoft.com/office/drawing/2016/5/9/chartex" xmlns:cx4="http://schemas.microsoft.com/office/drawing/2016/5/10/chartex" xmlns:cx5="http://schemas.microsoft.com/office/drawing/2016/5/11/chartex" xmlns:cx6="http://schemas.microsoft.com/office/drawing/2016/5/12/chartex" xmlns:cx7="http://schemas.microsoft.com/office/drawing/2016/5/13/chartex" xmlns:cx8="http://schemas.microsoft.com/office/drawing/2016/5/14/chartex" xmlns:mc="http://schemas.openxmlformats.org/markup-compatibility/2006" xmlns:aink="http://schemas.microsoft.com/office/drawing/2016/ink" xmlns:am3d="http://schemas.microsoft.com/office/drawing/2017/model3d" xmlns:o="urn:schemas-microsoft-com:office:office" xmlns:oel="http://schemas.microsoft.com/office/2019/extlst" xmlns:r="http://schemas.openxmlformats.org/officeDocument/2006/relationships" xmlns:m="http://schemas.openxmlformats.org/officeDocument/2006/math" xmlns:v="urn:schemas-microsoft-com:vml" xmlns:wp14="http://schemas.microsoft.com/office/word/2010/wordprocessingDrawing" xmlns:wp="http://schemas.openxmlformats.org/drawingml/2006/wordprocessingDrawing" xmlns:w10="urn:schemas-microsoft-com:office:word" xmlns:w="http://schemas.openxmlformats.org/wordprocessingml/2006/main" xmlns:w14="http://schemas.microsoft.com/office/word/2010/wordml" xmlns:w15="http://schemas.microsoft.com/office/word/2012/wordml" xmlns:w16cei="http://schemas.microsoft.com/office/word/2026/wordml/cei" xmlns:w16cex="http://schemas.microsoft.com/office/word/2018/wordml/cex" xmlns:w16cid="http://schemas.microsoft.com/office/word/2016/wordml/cid" xmlns:w16="http://schemas.microsoft.com/office/word/2018/wordml" xmlns:w16du="http://schemas.microsoft.com/office/word/2023/wordml/word16du" xmlns:w16sdtdh="http://schemas.microsoft.com/office/word/2020/wordml/sdtdatahash" xmlns:w16sdtfl="http://schemas.microsoft.com/office/word/2024/wordml/sdtformatlock" xmlns:w16se="http://schemas.microsoft.com/office/word/2015/wordml/symex" xmlns:wpg="http://schemas.microsoft.com/office/word/2010/wordprocessingGroup" xmlns:wpi="http://schemas.microsoft.com/office/word/2010/wordprocessingInk" xmlns:wne="http://schemas.microsoft.com/office/word/2006/wordml" xmlns:wps="http://schemas.microsoft.com/office/word/2010/wordprocessingShape" mc:Ignorable="w14 w15 w16se w16cid w16 w16cex w16sdtdh w16sdtfl w16du wp14">
-  <w:p>
-    <w:pPr>
+<w:ftr xmlns:w="http://schemas.openxmlformats.org/wordprocessingml/2006/main" xmlns:r="http://schemas.openxmlformats.org/officeDocument/2006/relationships">
+  <w:tbl>
+    <w:tblPr>
+      <w:tblW w:w="5000" w:type="pct"/>
       <w:jc w:val="center"/>
-      <w:rPr>
-        <w:rFonts w:ascii="Google Sans" w:hAnsi="Google Sans" w:cs="Google Sans"/>
-        <w:sz w:val="16"/>
-        <w:szCs w:val="16"/>
-      </w:rPr>
-    </w:pPr>
-    <w:r>
-      <w:rPr>
-        <w:rFonts w:ascii="Google Sans" w:hAnsi="Google Sans" w:cs="Google Sans"/>
-        <w:noProof/>
-      </w:rPr>
-      <mc:AlternateContent>
-        <mc:Choice Requires="wps">
-          <w:drawing>
-            <wp:anchor distT="0" distB="0" distL="114300" distR="114300" simplePos="0" relativeHeight="251668480" behindDoc="0" locked="0" layoutInCell="1" allowOverlap="1" wp14:anchorId="1C7C50C1" wp14:editId="6DB09250">
-              <wp:simplePos x="0" y="0"/>
-              <wp:positionH relativeFrom="column">
-                <wp:posOffset>-876300</wp:posOffset>
-              </wp:positionH>
-              <wp:positionV relativeFrom="paragraph">
-                <wp:posOffset>45720</wp:posOffset>
-              </wp:positionV>
-              <wp:extent cx="7686675" cy="0"/>
-              <wp:effectExtent l="38100" t="38100" r="66675" b="95250"/>
-              <wp:wrapNone/>
-              <wp:docPr id="406986958" name="Düz Bağlayıcı 1"/>
-              <wp:cNvGraphicFramePr/>
-              <a:graphic xmlns:a="http://schemas.openxmlformats.org/drawingml/2006/main">
-                <a:graphicData uri="http://schemas.microsoft.com/office/word/2010/wordprocessingShape">
-                  <wps:wsp>
-                    <wps:cNvCnPr/>
-                    <wps:spPr>
-                      <a:xfrm>
-                        <a:off x="0" y="0"/>
-                        <a:ext cx="7686675" cy="0"/>
-                      </a:xfrm>
-                      <a:prstGeom prst="line">
-                        <a:avLst/>
-                      </a:prstGeom>
-                    </wps:spPr>
-                    <wps:style>
-                      <a:lnRef idx="2">
-                        <a:schemeClr val="accent1"/>
-                      </a:lnRef>
-                      <a:fillRef idx="0">
-                        <a:schemeClr val="accent1"/>
-                      </a:fillRef>
-                      <a:effectRef idx="1">
-                        <a:schemeClr val="accent1"/>
-                      </a:effectRef>
-                      <a:fontRef idx="minor">
-                        <a:schemeClr val="tx1"/>
-                      </a:fontRef>
-                    </wps:style>
-                    <wps:bodyPr/>
-                  </wps:wsp>
-                </a:graphicData>
-              </a:graphic>
-            </wp:anchor>
-          </w:drawing>
-        </mc:Choice>
-        <mc:Fallback>
-          <w:pict>
-            <v:line w14:anchorId="18BEAD3E" id="Düz Bağlayıcı 1" o:spid="_x0000_s1026" style="position:absolute;z-index:251668480;visibility:visible;mso-wrap-style:square;mso-wrap-distance-left:9pt;mso-wrap-distance-top:0;mso-wrap-distance-right:9pt;mso-wrap-distance-bottom:0;mso-position-horizontal:absolute;mso-position-horizontal-relative:text;mso-position-vertical:absolute;mso-position-vertical-relative:text" from="-69pt,3.6pt" to="536.25pt,3.6pt" o:gfxdata="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" strokecolor="#4f81bd [3204]" strokeweight="2pt">
-              <v:shadow on="t" color="black" opacity="24903f" origin=",.5" offset="0,.55556mm"/>
-            </v:line>
-          </w:pict>
-        </mc:Fallback>
-      </mc:AlternateContent>
-    </w:r>
-    <w:r>
-      <w:rPr>
-        <w:rFonts w:ascii="Google Sans" w:hAnsi="Google Sans" w:cs="Google Sans"/>
-        <w:noProof/>
-        <w:sz w:val="16"/>
-        <w:szCs w:val="16"/>
-      </w:rPr>
-      <w:drawing>
-        <wp:anchor distT="0" distB="0" distL="114300" distR="114300" simplePos="0" relativeHeight="251670528" behindDoc="0" locked="0" layoutInCell="1" allowOverlap="1" wp14:anchorId="07584354" wp14:editId="788459C3">
-          <wp:simplePos x="0" y="0"/>
-          <wp:positionH relativeFrom="column">
-            <wp:posOffset>5086985</wp:posOffset>
-          </wp:positionH>
-          <wp:positionV relativeFrom="paragraph">
-            <wp:posOffset>51435</wp:posOffset>
-          </wp:positionV>
-          <wp:extent cx="1619885" cy="539750"/>
-          <wp:effectExtent l="0" t="0" r="0" b="0"/>
-          <wp:wrapNone/>
-          <wp:docPr id="878791880" name="Resim 3" descr="yazı tipi, grafik, logo, grafik tasarım içeren bir resim&#10;&#10;Yapay zeka tarafından oluşturulmuş içerik yanlış olabilir."/>
-          <wp:cNvGraphicFramePr>
-            <a:graphicFrameLocks xmlns:a="http://schemas.openxmlformats.org/drawingml/2006/main" noChangeAspect="1"/>
-          </wp:cNvGraphicFramePr>
-          <a:graphic xmlns:a="http://schemas.openxmlformats.org/drawingml/2006/main">
-            <a:graphicData uri="http://schemas.openxmlformats.org/drawingml/2006/picture">
-              <pic:pic xmlns:pic="http://schemas.openxmlformats.org/drawingml/2006/picture">
-                <pic:nvPicPr>
-                  <pic:cNvPr id="1414227508" name="Resim 3" descr="yazı tipi, grafik, logo, grafik tasarım içeren bir resim&#10;&#10;Yapay zeka tarafından oluşturulmuş içerik yanlış olabilir."/>
-                  <pic:cNvPicPr/>
-                </pic:nvPicPr>
-                <pic:blipFill>
-                  <a:blip r:embed="rId1">
-                    <a:extLst>
-                      <a:ext uri="{28A0092B-C50C-407E-A947-70E740481C1C}">
-                        <a14:useLocalDpi xmlns:a14="http://schemas.microsoft.com/office/drawing/2010/main" val="0"/>
-                      </a:ext>
-                    </a:extLst>
-                  </a:blip>
-                  <a:stretch>
-                    <a:fillRect/>
-                  </a:stretch>
-                </pic:blipFill>
-                <pic:spPr>
-                  <a:xfrm>
-                    <a:off x="0" y="0"/>
-                    <a:ext cx="1619885" cy="539750"/>
-                  </a:xfrm>
-                  <a:prstGeom prst="rect">
-                    <a:avLst/>
-                  </a:prstGeom>
-                </pic:spPr>
-              </pic:pic>
-            </a:graphicData>
-          </a:graphic>
-          <wp14:sizeRelH relativeFrom="margin">
-            <wp14:pctWidth>0</wp14:pctWidth>
-          </wp14:sizeRelH>
-          <wp14:sizeRelV relativeFrom="margin">
-            <wp14:pctHeight>0</wp14:pctHeight>
-          </wp14:sizeRelV>
-        </wp:anchor>
-      </w:drawing>
-    </w:r>
-    <w:r>
-      <w:rPr>
-        <w:rFonts w:ascii="Google Sans" w:hAnsi="Google Sans" w:cs="Google Sans"/>
-        <w:noProof/>
-        <w:sz w:val="16"/>
-        <w:szCs w:val="16"/>
-      </w:rPr>
-      <w:drawing>
-        <wp:anchor distT="0" distB="0" distL="114300" distR="114300" simplePos="0" relativeHeight="251669504" behindDoc="0" locked="0" layoutInCell="1" allowOverlap="1" wp14:anchorId="519A8BE3" wp14:editId="6EE148A9">
-          <wp:simplePos x="0" y="0"/>
-          <wp:positionH relativeFrom="column">
-            <wp:posOffset>-819150</wp:posOffset>
-          </wp:positionH>
-          <wp:positionV relativeFrom="paragraph">
-            <wp:posOffset>114935</wp:posOffset>
-          </wp:positionV>
-          <wp:extent cx="1672590" cy="471170"/>
-          <wp:effectExtent l="0" t="0" r="3810" b="5080"/>
-          <wp:wrapNone/>
-          <wp:docPr id="1058125544" name="Resim 2" descr="yazı tipi, grafik, ekran görüntüsü, metin içeren bir resim&#10;&#10;Yapay zeka tarafından oluşturulmuş içerik yanlış olabilir."/>
-          <wp:cNvGraphicFramePr>
-            <a:graphicFrameLocks xmlns:a="http://schemas.openxmlformats.org/drawingml/2006/main" noChangeAspect="1"/>
-          </wp:cNvGraphicFramePr>
-          <a:graphic xmlns:a="http://schemas.openxmlformats.org/drawingml/2006/main">
-            <a:graphicData uri="http://schemas.openxmlformats.org/drawingml/2006/picture">
-              <pic:pic xmlns:pic="http://schemas.openxmlformats.org/drawingml/2006/picture">
-                <pic:nvPicPr>
-                  <pic:cNvPr id="1684236520" name="Resim 2" descr="yazı tipi, grafik, ekran görüntüsü, metin içeren bir resim&#10;&#10;Yapay zeka tarafından oluşturulmuş içerik yanlış olabilir."/>
-                  <pic:cNvPicPr/>
-                </pic:nvPicPr>
-                <pic:blipFill>
-                  <a:blip r:embed="rId2">
-                    <a:extLst>
-                      <a:ext uri="{28A0092B-C50C-407E-A947-70E740481C1C}">
-                        <a14:useLocalDpi xmlns:a14="http://schemas.microsoft.com/office/drawing/2010/main" val="0"/>
-                      </a:ext>
-                    </a:extLst>
-                  </a:blip>
-                  <a:stretch>
-                    <a:fillRect/>
-                  </a:stretch>
-                </pic:blipFill>
-                <pic:spPr>
-                  <a:xfrm>
-                    <a:off x="0" y="0"/>
-                    <a:ext cx="1672590" cy="471170"/>
-                  </a:xfrm>
-                  <a:prstGeom prst="rect">
-                    <a:avLst/>
-                  </a:prstGeom>
-                </pic:spPr>
-              </pic:pic>
-            </a:graphicData>
-          </a:graphic>
-          <wp14:sizeRelH relativeFrom="margin">
-            <wp14:pctWidth>0</wp14:pctWidth>
-          </wp14:sizeRelH>
-          <wp14:sizeRelV relativeFrom="margin">
-            <wp14:pctHeight>0</wp14:pctHeight>
-          </wp14:sizeRelV>
-        </wp:anchor>
-      </w:drawing>
-    </w:r>
-  </w:p>
-  <w:p>
-    <w:pPr>
-      <w:jc w:val="center"/>
-      <w:rPr>
-        <w:rFonts w:ascii="Google Sans" w:hAnsi="Google Sans" w:cs="Google Sans"/>
-        <w:sz w:val="16"/>
-        <w:szCs w:val="16"/>
-      </w:rPr>
-    </w:pPr>
-    <w:hyperlink r:id="rId3" w:history="1">
-      <w:r>
-        <w:rPr>
-          <w:rStyle w:val="Kpr"/>
-          <w:rFonts w:ascii="Google Sans" w:hAnsi="Google Sans" w:cs="Google Sans"/>
-          <w:color w:val="auto"/>
-          <w:sz w:val="16"/>
-          <w:szCs w:val="16"/>
-          <w:u w:val="none"/>
-        </w:rPr>
-        <w:t>www.polchem.com.tr</w:t>
-      </w:r>
-    </w:hyperlink>
-  </w:p>
-  <w:p>
-    <w:pPr>
-      <w:jc w:val="center"/>
-      <w:rPr>
-        <w:rFonts w:ascii="Google Sans" w:hAnsi="Google Sans" w:cs="Google Sans"/>
-        <w:sz w:val="16"/>
-        <w:szCs w:val="16"/>
-      </w:rPr>
-    </w:pPr>
-    <w:hyperlink r:id="rId4" w:history="1">
-      <w:r>
-        <w:rPr>
-          <w:rStyle w:val="Kpr"/>
-          <w:rFonts w:ascii="Google Sans" w:hAnsi="Google Sans" w:cs="Google Sans"/>
-          <w:color w:val="auto"/>
-          <w:sz w:val="16"/>
-          <w:szCs w:val="16"/>
-          <w:u w:val="none"/>
-        </w:rPr>
-        <w:t>www.aypol.com.tr</w:t>
-      </w:r>
-    </w:hyperlink>
-  </w:p>
-  <w:p>
-    <w:pPr>
-      <w:jc w:val="center"/>
-      <w:rPr>
-        <w:rStyle w:val="Kpr"/>
-        <w:rFonts w:ascii="Google Sans" w:hAnsi="Google Sans" w:cs="Google Sans"/>
-        <w:color w:val="auto"/>
-        <w:sz w:val="16"/>
-        <w:szCs w:val="16"/>
-        <w:u w:val="none"/>
-      </w:rPr>
-    </w:pPr>
-    <w:r>
-      <w:rPr>
-        <w:rStyle w:val="Kpr"/>
-        <w:rFonts w:ascii="Google Sans" w:hAnsi="Google Sans" w:cs="Google Sans"/>
-        <w:color w:val="auto"/>
-        <w:sz w:val="16"/>
-        <w:szCs w:val="16"/>
-        <w:u w:val="none"/>
-      </w:rPr>
-      <w:t>www.gokayboya.com.tr</w:t>
-    </w:r>
-  </w:p>
+      <w:tblBorders>
+        <w:top w:val="single" w:sz="6" w:space="0" w:color="333333"/>
+        <w:left w:val="none"/>
+        <w:bottom w:val="none"/>
+        <w:right w:val="none"/>
+        <w:insideH w:val="none"/>
+        <w:insideV w:val="none"/>
+      </w:tblBorders>
+      <w:tblCellMar>
+        <w:top w:w="60" w:type="dxa"/>
+        <w:bottom w:w="40" w:type="dxa"/>
+        <w:left w:w="40" w:type="dxa"/>
+        <w:right w:w="40" w:type="dxa"/>
+      </w:tblCellMar>
+    </w:tblPr>
+    <w:tblGrid>
+      <w:gridCol w:w="2527"/>
+      <w:gridCol w:w="2527"/>
+      <w:gridCol w:w="2527"/>
+      <w:gridCol w:w="1445"/>
+    </w:tblGrid>
+    <w:tr>
+      <w:trPr>
+        <w:cantSplit/>
+      </w:trPr>
+      <w:tc>
+        <w:tcPr>
+          <w:tcW w:w="1400" w:type="pct"/>
+          <w:vAlign w:val="center"/>
+        </w:tcPr>
+        <w:p>
+          <w:pPr>
+            <w:jc w:val="left"/>
+            <w:spacing w:before="40" w:after="0" w:line="240" w:lineRule="auto"/>
+          </w:pPr>
+          <w:r>
+            <w:rPr>
+              <w:rFonts w:ascii="Google Sans" w:hAnsi="Google Sans" w:cs="Google Sans"/>
+              <w:b/>
+              <w:sz w:val="15"/>
+              <w:szCs w:val="15"/>
+              <w:color w:val="333333"/>
+            </w:rPr>
+            <w:t>POLCHEM</w:t>
+          </w:r>
+          <w:r>
+            <w:rPr>
+              <w:rFonts w:ascii="Google Sans" w:hAnsi="Google Sans" w:cs="Google Sans"/>
+              <w:sz w:val="15"/>
+              <w:szCs w:val="15"/>
+              <w:color w:val="333333"/>
+            </w:rPr>
+            <w:t xml:space="preserve"> | www.polchem.com.tr</w:t>
+          </w:r>
+        </w:p>
+      </w:tc>
+      <w:tc>
+        <w:tcPr>
+          <w:tcW w:w="1400" w:type="pct"/>
+          <w:vAlign w:val="center"/>
+        </w:tcPr>
+        <w:p>
+          <w:pPr>
+            <w:jc w:val="center"/>
+            <w:spacing w:before="40" w:after="0" w:line="240" w:lineRule="auto"/>
+          </w:pPr>
+          <w:r>
+            <w:rPr>
+              <w:rFonts w:ascii="Google Sans" w:hAnsi="Google Sans" w:cs="Google Sans"/>
+              <w:b/>
+              <w:sz w:val="15"/>
+              <w:szCs w:val="15"/>
+              <w:color w:val="333333"/>
+            </w:rPr>
+            <w:t>AYPOL</w:t>
+          </w:r>
+          <w:r>
+            <w:rPr>
+              <w:rFonts w:ascii="Google Sans" w:hAnsi="Google Sans" w:cs="Google Sans"/>
+              <w:sz w:val="15"/>
+              <w:szCs w:val="15"/>
+              <w:color w:val="333333"/>
+            </w:rPr>
+            <w:t xml:space="preserve"> | www.aypol.com.tr</w:t>
+          </w:r>
+        </w:p>
+      </w:tc>
+      <w:tc>
+        <w:tcPr>
+          <w:tcW w:w="1400" w:type="pct"/>
+          <w:vAlign w:val="center"/>
+        </w:tcPr>
+        <w:p>
+          <w:pPr>
+            <w:jc w:val="center"/>
+            <w:spacing w:before="40" w:after="0" w:line="240" w:lineRule="auto"/>
+          </w:pPr>
+          <w:r>
+            <w:rPr>
+              <w:rFonts w:ascii="Google Sans" w:hAnsi="Google Sans" w:cs="Google Sans"/>
+              <w:b/>
+              <w:sz w:val="15"/>
+              <w:szCs w:val="15"/>
+              <w:color w:val="333333"/>
+            </w:rPr>
+            <w:t>GÖKAY</w:t>
+          </w:r>
+          <w:r>
+            <w:rPr>
+              <w:rFonts w:ascii="Google Sans" w:hAnsi="Google Sans" w:cs="Google Sans"/>
+              <w:sz w:val="15"/>
+              <w:szCs w:val="15"/>
+              <w:color w:val="333333"/>
+            </w:rPr>
+            <w:t xml:space="preserve"> | www.gokayboya.com.tr</w:t>
+          </w:r>
+        </w:p>
+      </w:tc>
+      <w:tc>
+        <w:tcPr>
+          <w:tcW w:w="800" w:type="pct"/>
+          <w:vAlign w:val="center"/>
+        </w:tcPr>
+        <w:p>
+          <w:pPr>
+            <w:jc w:val="right"/>
+            <w:spacing w:before="40" w:after="0" w:line="240" w:lineRule="auto"/>
+          </w:pPr>
+          <w:r>
+            <w:rPr>
+              <w:rFonts w:ascii="Google Sans" w:hAnsi="Google Sans" w:cs="Google Sans"/>
+              <w:b/>
+              <w:sz w:val="15"/>
+              <w:szCs w:val="15"/>
+              <w:color w:val="000000"/>
+            </w:rPr>
+            <w:t xml:space="preserve">Sayfa </w:t>
+          </w:r>
+          <w:fldSimple w:instr="PAGE">
+            <w:r>
+              <w:rPr>
+                <w:rFonts w:ascii="Google Sans" w:hAnsi="Google Sans" w:cs="Google Sans"/>
+                <w:b/>
+                <w:sz w:val="15"/>
+                <w:szCs w:val="15"/>
+                <w:color w:val="000000"/>
+              </w:rPr>
+              <w:t>1</w:t>
+            </w:r>
+          </w:fldSimple>
+          <w:r>
+            <w:rPr>
+              <w:rFonts w:ascii="Google Sans" w:hAnsi="Google Sans" w:cs="Google Sans"/>
+              <w:b/>
+              <w:sz w:val="15"/>
+              <w:szCs w:val="15"/>
+              <w:color w:val="000000"/>
+            </w:rPr>
+            <w:t xml:space="preserve"> / </w:t>
+          </w:r>
+          <w:fldSimple w:instr="NUMPAGES">
+            <w:r>
+              <w:rPr>
+                <w:rFonts w:ascii="Google Sans" w:hAnsi="Google Sans" w:cs="Google Sans"/>
+                <w:b/>
+                <w:sz w:val="15"/>
+                <w:szCs w:val="15"/>
+                <w:color w:val="000000"/>
+              </w:rPr>
+              <w:t>1</w:t>
+            </w:r>
+          </w:fldSimple>
+        </w:p>
+      </w:tc>
+    </w:tr>
+  </w:tbl>
 </w:ftr>
 </file>
 
 <file path=word/footer2.xml><?xml version="1.0" encoding="utf-8"?>
-<w:ftr xmlns:wpc="http://schemas.microsoft.com/office/word/2010/wordprocessingCanvas" xmlns:cx="http://schemas.microsoft.com/office/drawing/2014/chartex" xmlns:cx1="http://schemas.microsoft.com/office/drawing/2015/9/8/chartex" xmlns:cx2="http://schemas.microsoft.com/office/drawing/2015/10/21/chartex" xmlns:cx3="http://schemas.microsoft.com/office/drawing/2016/5/9/chartex" xmlns:cx4="http://schemas.microsoft.com/office/drawing/2016/5/10/chartex" xmlns:cx5="http://schemas.microsoft.com/office/drawing/2016/5/11/chartex" xmlns:cx6="http://schemas.microsoft.com/office/drawing/2016/5/12/chartex" xmlns:cx7="http://schemas.microsoft.com/office/drawing/2016/5/13/chartex" xmlns:cx8="http://schemas.microsoft.com/office/drawing/2016/5/14/chartex" xmlns:mc="http://schemas.openxmlformats.org/markup-compatibility/2006" xmlns:aink="http://schemas.microsoft.com/office/drawing/2016/ink" xmlns:am3d="http://schemas.microsoft.com/office/drawing/2017/model3d" xmlns:o="urn:schemas-microsoft-com:office:office" xmlns:oel="http://schemas.microsoft.com/office/2019/extlst" xmlns:r="http://schemas.openxmlformats.org/officeDocument/2006/relationships" xmlns:m="http://schemas.openxmlformats.org/officeDocument/2006/math" xmlns:v="urn:schemas-microsoft-com:vml" xmlns:wp14="http://schemas.microsoft.com/office/word/2010/wordprocessingDrawing" xmlns:wp="http://schemas.openxmlformats.org/drawingml/2006/wordprocessingDrawing" xmlns:w10="urn:schemas-microsoft-com:office:word" xmlns:w="http://schemas.openxmlformats.org/wordprocessingml/2006/main" xmlns:w14="http://schemas.microsoft.com/office/word/2010/wordml" xmlns:w15="http://schemas.microsoft.com/office/word/2012/wordml" xmlns:w16cei="http://schemas.microsoft.com/office/word/2026/wordml/cei" xmlns:w16cex="http://schemas.microsoft.com/office/word/2018/wordml/cex" xmlns:w16cid="http://schemas.microsoft.com/office/word/2016/wordml/cid" xmlns:w16="http://schemas.microsoft.com/office/word/2018/wordml" xmlns:w16du="http://schemas.microsoft.com/office/word/2023/wordml/word16du" xmlns:w16sdtdh="http://schemas.microsoft.com/office/word/2020/wordml/sdtdatahash" xmlns:w16sdtfl="http://schemas.microsoft.com/office/word/2024/wordml/sdtformatlock" xmlns:w16se="http://schemas.microsoft.com/office/word/2015/wordml/symex" xmlns:wpg="http://schemas.microsoft.com/office/word/2010/wordprocessingGroup" xmlns:wpi="http://schemas.microsoft.com/office/word/2010/wordprocessingInk" xmlns:wne="http://schemas.microsoft.com/office/word/2006/wordml" xmlns:wps="http://schemas.microsoft.com/office/word/2010/wordprocessingShape" mc:Ignorable="w14 w15 w16se w16cid w16 w16cex w16sdtdh w16sdtfl w16du wp14">
-  <w:p>
-    <w:pPr>
+<w:ftr xmlns:w="http://schemas.openxmlformats.org/wordprocessingml/2006/main" xmlns:r="http://schemas.openxmlformats.org/officeDocument/2006/relationships">
+  <w:tbl>
+    <w:tblPr>
+      <w:tblW w:w="5000" w:type="pct"/>
       <w:jc w:val="center"/>
-      <w:rPr>
-        <w:rFonts w:ascii="Google Sans" w:hAnsi="Google Sans" w:cs="Google Sans"/>
-        <w:sz w:val="16"/>
-        <w:szCs w:val="16"/>
-      </w:rPr>
-    </w:pPr>
-    <w:r>
-      <w:rPr>
-        <w:rFonts w:ascii="Google Sans" w:hAnsi="Google Sans" w:cs="Google Sans"/>
-        <w:noProof/>
-      </w:rPr>
-      <w:drawing>
-        <wp:anchor distT="114300" distB="114300" distL="114300" distR="114300" simplePos="0" relativeHeight="251660288" behindDoc="0" locked="0" layoutInCell="1" hidden="0" allowOverlap="1" wp14:anchorId="384D2DAE" wp14:editId="71E57CB9">
-          <wp:simplePos x="0" y="0"/>
-          <wp:positionH relativeFrom="column">
-            <wp:posOffset>5096510</wp:posOffset>
-          </wp:positionH>
-          <wp:positionV relativeFrom="paragraph">
-            <wp:posOffset>26035</wp:posOffset>
-          </wp:positionV>
-          <wp:extent cx="1619885" cy="539750"/>
-          <wp:effectExtent l="0" t="0" r="0" b="0"/>
-          <wp:wrapNone/>
-          <wp:docPr id="2106678074" name="image3.png"/>
-          <wp:cNvGraphicFramePr/>
-          <a:graphic xmlns:a="http://schemas.openxmlformats.org/drawingml/2006/main">
-            <a:graphicData uri="http://schemas.openxmlformats.org/drawingml/2006/picture">
-              <pic:pic xmlns:pic="http://schemas.openxmlformats.org/drawingml/2006/picture">
-                <pic:nvPicPr>
-                  <pic:cNvPr id="0" name="image3.png"/>
-                  <pic:cNvPicPr preferRelativeResize="0"/>
-                </pic:nvPicPr>
-                <pic:blipFill>
-                  <a:blip r:embed="rId1"/>
-                  <a:srcRect/>
-                  <a:stretch>
-                    <a:fillRect/>
-                  </a:stretch>
-                </pic:blipFill>
-                <pic:spPr>
-                  <a:xfrm>
-                    <a:off x="0" y="0"/>
-                    <a:ext cx="1619885" cy="539750"/>
-                  </a:xfrm>
-                  <a:prstGeom prst="rect">
-                    <a:avLst/>
-                  </a:prstGeom>
-                  <a:ln/>
-                </pic:spPr>
-              </pic:pic>
-            </a:graphicData>
-          </a:graphic>
-        </wp:anchor>
-      </w:drawing>
-    </w:r>
-    <w:r>
-      <w:rPr>
-        <w:rFonts w:ascii="Google Sans" w:hAnsi="Google Sans" w:cs="Google Sans"/>
-        <w:noProof/>
-      </w:rPr>
-      <w:drawing>
-        <wp:anchor distT="114300" distB="114300" distL="114300" distR="114300" simplePos="0" relativeHeight="251661312" behindDoc="0" locked="0" layoutInCell="1" hidden="0" allowOverlap="1" wp14:anchorId="7FBF6313" wp14:editId="74EDF5B3">
-          <wp:simplePos x="0" y="0"/>
-          <wp:positionH relativeFrom="column">
-            <wp:posOffset>-761365</wp:posOffset>
-          </wp:positionH>
-          <wp:positionV relativeFrom="paragraph">
-            <wp:posOffset>108585</wp:posOffset>
-          </wp:positionV>
-          <wp:extent cx="1685290" cy="471170"/>
-          <wp:effectExtent l="0" t="0" r="0" b="5080"/>
-          <wp:wrapNone/>
-          <wp:docPr id="172149542" name="image8.png"/>
-          <wp:cNvGraphicFramePr/>
-          <a:graphic xmlns:a="http://schemas.openxmlformats.org/drawingml/2006/main">
-            <a:graphicData uri="http://schemas.openxmlformats.org/drawingml/2006/picture">
-              <pic:pic xmlns:pic="http://schemas.openxmlformats.org/drawingml/2006/picture">
-                <pic:nvPicPr>
-                  <pic:cNvPr id="0" name="image8.png"/>
-                  <pic:cNvPicPr preferRelativeResize="0"/>
-                </pic:nvPicPr>
-                <pic:blipFill>
-                  <a:blip r:embed="rId2"/>
-                  <a:srcRect/>
-                  <a:stretch>
-                    <a:fillRect/>
-                  </a:stretch>
-                </pic:blipFill>
-                <pic:spPr>
-                  <a:xfrm>
-                    <a:off x="0" y="0"/>
-                    <a:ext cx="1685290" cy="471170"/>
-                  </a:xfrm>
-                  <a:prstGeom prst="rect">
-                    <a:avLst/>
-                  </a:prstGeom>
-                  <a:ln/>
-                </pic:spPr>
-              </pic:pic>
-            </a:graphicData>
-          </a:graphic>
-        </wp:anchor>
-      </w:drawing>
-    </w:r>
-    <w:r>
-      <w:rPr>
-        <w:rFonts w:ascii="Google Sans" w:hAnsi="Google Sans" w:cs="Google Sans"/>
-        <w:noProof/>
-      </w:rPr>
-      <mc:AlternateContent>
-        <mc:Choice Requires="wps">
-          <w:drawing>
-            <wp:anchor distT="0" distB="0" distL="114300" distR="114300" simplePos="0" relativeHeight="251666432" behindDoc="0" locked="0" layoutInCell="1" allowOverlap="1" wp14:anchorId="1375D277" wp14:editId="7FA11172">
-              <wp:simplePos x="0" y="0"/>
-              <wp:positionH relativeFrom="column">
-                <wp:posOffset>-876300</wp:posOffset>
-              </wp:positionH>
-              <wp:positionV relativeFrom="paragraph">
-                <wp:posOffset>47625</wp:posOffset>
-              </wp:positionV>
-              <wp:extent cx="7686675" cy="0"/>
-              <wp:effectExtent l="38100" t="38100" r="66675" b="95250"/>
-              <wp:wrapNone/>
-              <wp:docPr id="707194563" name="Düz Bağlayıcı 1"/>
-              <wp:cNvGraphicFramePr/>
-              <a:graphic xmlns:a="http://schemas.openxmlformats.org/drawingml/2006/main">
-                <a:graphicData uri="http://schemas.microsoft.com/office/word/2010/wordprocessingShape">
-                  <wps:wsp>
-                    <wps:cNvCnPr/>
-                    <wps:spPr>
-                      <a:xfrm>
-                        <a:off x="0" y="0"/>
-                        <a:ext cx="7686675" cy="0"/>
-                      </a:xfrm>
-                      <a:prstGeom prst="line">
-                        <a:avLst/>
-                      </a:prstGeom>
-                    </wps:spPr>
-                    <wps:style>
-                      <a:lnRef idx="2">
-                        <a:schemeClr val="accent1"/>
-                      </a:lnRef>
-                      <a:fillRef idx="0">
-                        <a:schemeClr val="accent1"/>
-                      </a:fillRef>
-                      <a:effectRef idx="1">
-                        <a:schemeClr val="accent1"/>
-                      </a:effectRef>
-                      <a:fontRef idx="minor">
-                        <a:schemeClr val="tx1"/>
-                      </a:fontRef>
-                    </wps:style>
-                    <wps:bodyPr/>
-                  </wps:wsp>
-                </a:graphicData>
-              </a:graphic>
-            </wp:anchor>
-          </w:drawing>
-        </mc:Choice>
-        <mc:Fallback>
-          <w:pict>
-            <v:line w14:anchorId="06DE60B8" id="Düz Bağlayıcı 1" o:spid="_x0000_s1026" style="position:absolute;z-index:251666432;visibility:visible;mso-wrap-style:square;mso-wrap-distance-left:9pt;mso-wrap-distance-top:0;mso-wrap-distance-right:9pt;mso-wrap-distance-bottom:0;mso-position-horizontal:absolute;mso-position-horizontal-relative:text;mso-position-vertical:absolute;mso-position-vertical-relative:text" from="-69pt,3.75pt" to="536.25pt,3.75pt" o:gfxdata="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" strokecolor="#4f81bd [3204]" strokeweight="2pt">
-              <v:shadow on="t" color="black" opacity="24903f" origin=",.5" offset="0,.55556mm"/>
-            </v:line>
-          </w:pict>
-        </mc:Fallback>
-      </mc:AlternateContent>
-    </w:r>
-  </w:p>
-  <w:p>
-    <w:pPr>
-      <w:jc w:val="center"/>
-      <w:rPr>
-        <w:rFonts w:ascii="Google Sans" w:hAnsi="Google Sans" w:cs="Google Sans"/>
-        <w:sz w:val="16"/>
-        <w:szCs w:val="16"/>
-      </w:rPr>
-    </w:pPr>
-    <w:r>
-      <w:rPr>
-        <w:rFonts w:ascii="Google Sans" w:hAnsi="Google Sans" w:cs="Google Sans"/>
-        <w:sz w:val="16"/>
-        <w:szCs w:val="16"/>
-      </w:rPr>
-      <w:t>www.polchem.com.tr</w:t>
-    </w:r>
-  </w:p>
-  <w:p>
-    <w:pPr>
-      <w:jc w:val="center"/>
-      <w:rPr>
-        <w:rFonts w:ascii="Google Sans" w:hAnsi="Google Sans" w:cs="Google Sans"/>
-        <w:sz w:val="16"/>
-        <w:szCs w:val="16"/>
-      </w:rPr>
-    </w:pPr>
-    <w:hyperlink r:id="rId3" w:history="1">
-      <w:r>
-        <w:rPr>
-          <w:rStyle w:val="Kpr"/>
-          <w:rFonts w:ascii="Google Sans" w:hAnsi="Google Sans" w:cs="Google Sans"/>
-          <w:color w:val="auto"/>
-          <w:sz w:val="16"/>
-          <w:szCs w:val="16"/>
-          <w:u w:val="none"/>
-        </w:rPr>
-        <w:t>www.aypol.com.tr</w:t>
-      </w:r>
-    </w:hyperlink>
-  </w:p>
-  <w:p>
-    <w:pPr>
-      <w:jc w:val="center"/>
-      <w:rPr>
-        <w:rFonts w:ascii="Google Sans" w:hAnsi="Google Sans" w:cs="Google Sans"/>
-        <w:sz w:val="16"/>
-        <w:szCs w:val="16"/>
-      </w:rPr>
-    </w:pPr>
-    <w:r>
-      <w:rPr>
-        <w:rStyle w:val="Kpr"/>
-        <w:rFonts w:ascii="Google Sans" w:hAnsi="Google Sans" w:cs="Google Sans"/>
-        <w:color w:val="auto"/>
-        <w:sz w:val="16"/>
-        <w:szCs w:val="16"/>
-        <w:u w:val="none"/>
-      </w:rPr>
-      <w:t>www.gokayboya.com.tr</w:t>
-    </w:r>
-  </w:p>
+      <w:tblBorders>
+        <w:top w:val="single" w:sz="6" w:space="0" w:color="333333"/>
+        <w:left w:val="none"/>
+        <w:bottom w:val="none"/>
+        <w:right w:val="none"/>
+        <w:insideH w:val="none"/>
+        <w:insideV w:val="none"/>
+      </w:tblBorders>
+      <w:tblCellMar>
+        <w:top w:w="60" w:type="dxa"/>
+        <w:bottom w:w="40" w:type="dxa"/>
+        <w:left w:w="40" w:type="dxa"/>
+        <w:right w:w="40" w:type="dxa"/>
+      </w:tblCellMar>
+    </w:tblPr>
+    <w:tblGrid>
+      <w:gridCol w:w="2527"/>
+      <w:gridCol w:w="2527"/>
+      <w:gridCol w:w="2527"/>
+      <w:gridCol w:w="1445"/>
+    </w:tblGrid>
+    <w:tr>
+      <w:trPr>
+        <w:cantSplit/>
+      </w:trPr>
+      <w:tc>
+        <w:tcPr>
+          <w:tcW w:w="1400" w:type="pct"/>
+          <w:vAlign w:val="center"/>
+        </w:tcPr>
+        <w:p>
+          <w:pPr>
+            <w:jc w:val="left"/>
+            <w:spacing w:before="40" w:after="0" w:line="240" w:lineRule="auto"/>
+          </w:pPr>
+          <w:r>
+            <w:rPr>
+              <w:rFonts w:ascii="Google Sans" w:hAnsi="Google Sans" w:cs="Google Sans"/>
+              <w:b/>
+              <w:sz w:val="15"/>
+              <w:szCs w:val="15"/>
+              <w:color w:val="333333"/>
+            </w:rPr>
+            <w:t>POLCHEM</w:t>
+          </w:r>
+          <w:r>
+            <w:rPr>
+              <w:rFonts w:ascii="Google Sans" w:hAnsi="Google Sans" w:cs="Google Sans"/>
+              <w:sz w:val="15"/>
+              <w:szCs w:val="15"/>
+              <w:color w:val="333333"/>
+            </w:rPr>
+            <w:t xml:space="preserve"> | www.polchem.com.tr</w:t>
+          </w:r>
+        </w:p>
+      </w:tc>
+      <w:tc>
+        <w:tcPr>
+          <w:tcW w:w="1400" w:type="pct"/>
+          <w:vAlign w:val="center"/>
+        </w:tcPr>
+        <w:p>
+          <w:pPr>
+            <w:jc w:val="center"/>
+            <w:spacing w:before="40" w:after="0" w:line="240" w:lineRule="auto"/>
+          </w:pPr>
+          <w:r>
+            <w:rPr>
+              <w:rFonts w:ascii="Google Sans" w:hAnsi="Google Sans" w:cs="Google Sans"/>
+              <w:b/>
+              <w:sz w:val="15"/>
+              <w:szCs w:val="15"/>
+              <w:color w:val="333333"/>
+            </w:rPr>
+            <w:t>AYPOL</w:t>
+          </w:r>
+          <w:r>
+            <w:rPr>
+              <w:rFonts w:ascii="Google Sans" w:hAnsi="Google Sans" w:cs="Google Sans"/>
+              <w:sz w:val="15"/>
+              <w:szCs w:val="15"/>
+              <w:color w:val="333333"/>
+            </w:rPr>
+            <w:t xml:space="preserve"> | www.aypol.com.tr</w:t>
+          </w:r>
+        </w:p>
+      </w:tc>
+      <w:tc>
+        <w:tcPr>
+          <w:tcW w:w="1400" w:type="pct"/>
+          <w:vAlign w:val="center"/>
+        </w:tcPr>
+        <w:p>
+          <w:pPr>
+            <w:jc w:val="center"/>
+            <w:spacing w:before="40" w:after="0" w:line="240" w:lineRule="auto"/>
+          </w:pPr>
+          <w:r>
+            <w:rPr>
+              <w:rFonts w:ascii="Google Sans" w:hAnsi="Google Sans" w:cs="Google Sans"/>
+              <w:b/>
+              <w:sz w:val="15"/>
+              <w:szCs w:val="15"/>
+              <w:color w:val="333333"/>
+            </w:rPr>
+            <w:t>GÖKAY</w:t>
+          </w:r>
+          <w:r>
+            <w:rPr>
+              <w:rFonts w:ascii="Google Sans" w:hAnsi="Google Sans" w:cs="Google Sans"/>
+              <w:sz w:val="15"/>
+              <w:szCs w:val="15"/>
+              <w:color w:val="333333"/>
+            </w:rPr>
+            <w:t xml:space="preserve"> | www.gokayboya.com.tr</w:t>
+          </w:r>
+        </w:p>
+      </w:tc>
+      <w:tc>
+        <w:tcPr>
+          <w:tcW w:w="800" w:type="pct"/>
+          <w:vAlign w:val="center"/>
+        </w:tcPr>
+        <w:p>
+          <w:pPr>
+            <w:jc w:val="right"/>
+            <w:spacing w:before="40" w:after="0" w:line="240" w:lineRule="auto"/>
+          </w:pPr>
+          <w:r>
+            <w:rPr>
+              <w:rFonts w:ascii="Google Sans" w:hAnsi="Google Sans" w:cs="Google Sans"/>
+              <w:b/>
+              <w:sz w:val="15"/>
+              <w:szCs w:val="15"/>
+              <w:color w:val="000000"/>
+            </w:rPr>
+            <w:t xml:space="preserve">Sayfa </w:t>
+          </w:r>
+          <w:fldSimple w:instr="PAGE">
+            <w:r>
+              <w:rPr>
+                <w:rFonts w:ascii="Google Sans" w:hAnsi="Google Sans" w:cs="Google Sans"/>
+                <w:b/>
+                <w:sz w:val="15"/>
+                <w:szCs w:val="15"/>
+                <w:color w:val="000000"/>
+              </w:rPr>
+              <w:t>1</w:t>
+            </w:r>
+          </w:fldSimple>
+          <w:r>
+            <w:rPr>
+              <w:rFonts w:ascii="Google Sans" w:hAnsi="Google Sans" w:cs="Google Sans"/>
+              <w:b/>
+              <w:sz w:val="15"/>
+              <w:szCs w:val="15"/>
+              <w:color w:val="000000"/>
+            </w:rPr>
+            <w:t xml:space="preserve"> / </w:t>
+          </w:r>
+          <w:fldSimple w:instr="NUMPAGES">
+            <w:r>
+              <w:rPr>
+                <w:rFonts w:ascii="Google Sans" w:hAnsi="Google Sans" w:cs="Google Sans"/>
+                <w:b/>
+                <w:sz w:val="15"/>
+                <w:szCs w:val="15"/>
+                <w:color w:val="000000"/>
+              </w:rPr>
+              <w:t>1</w:t>
+            </w:r>
+          </w:fldSimple>
+        </w:p>
+      </w:tc>
+    </w:tr>
+  </w:tbl>
 </w:ftr>
 </file>
 

</xml_diff>

<commit_message>
fix(export): synchronize docx header with pdf and update regulatory subtitle to official KKDİK statement
</commit_message>
<xml_diff>
--- a/backend/app/templates/GBF_ANTET_TEMPLATE.docx
+++ b/backend/app/templates/GBF_ANTET_TEMPLATE.docx
@@ -926,461 +926,103 @@
 </file>
 
 <file path=word/header1.xml><?xml version="1.0" encoding="utf-8"?>
-<w:hdr xmlns:wpc="http://schemas.microsoft.com/office/word/2010/wordprocessingCanvas" xmlns:cx="http://schemas.microsoft.com/office/drawing/2014/chartex" xmlns:cx1="http://schemas.microsoft.com/office/drawing/2015/9/8/chartex" xmlns:cx2="http://schemas.microsoft.com/office/drawing/2015/10/21/chartex" xmlns:cx3="http://schemas.microsoft.com/office/drawing/2016/5/9/chartex" xmlns:cx4="http://schemas.microsoft.com/office/drawing/2016/5/10/chartex" xmlns:cx5="http://schemas.microsoft.com/office/drawing/2016/5/11/chartex" xmlns:cx6="http://schemas.microsoft.com/office/drawing/2016/5/12/chartex" xmlns:cx7="http://schemas.microsoft.com/office/drawing/2016/5/13/chartex" xmlns:cx8="http://schemas.microsoft.com/office/drawing/2016/5/14/chartex" xmlns:mc="http://schemas.openxmlformats.org/markup-compatibility/2006" xmlns:aink="http://schemas.microsoft.com/office/drawing/2016/ink" xmlns:am3d="http://schemas.microsoft.com/office/drawing/2017/model3d" xmlns:o="urn:schemas-microsoft-com:office:office" xmlns:oel="http://schemas.microsoft.com/office/2019/extlst" xmlns:r="http://schemas.openxmlformats.org/officeDocument/2006/relationships" xmlns:m="http://schemas.openxmlformats.org/officeDocument/2006/math" xmlns:v="urn:schemas-microsoft-com:vml" xmlns:wp14="http://schemas.microsoft.com/office/word/2010/wordprocessingDrawing" xmlns:wp="http://schemas.openxmlformats.org/drawingml/2006/wordprocessingDrawing" xmlns:w10="urn:schemas-microsoft-com:office:word" xmlns:w="http://schemas.openxmlformats.org/wordprocessingml/2006/main" xmlns:w14="http://schemas.microsoft.com/office/word/2010/wordml" xmlns:w15="http://schemas.microsoft.com/office/word/2012/wordml" xmlns:w16cei="http://schemas.microsoft.com/office/word/2026/wordml/cei" xmlns:w16cex="http://schemas.microsoft.com/office/word/2018/wordml/cex" xmlns:w16cid="http://schemas.microsoft.com/office/word/2016/wordml/cid" xmlns:w16="http://schemas.microsoft.com/office/word/2018/wordml" xmlns:w16du="http://schemas.microsoft.com/office/word/2023/wordml/word16du" xmlns:w16sdtdh="http://schemas.microsoft.com/office/word/2020/wordml/sdtdatahash" xmlns:w16sdtfl="http://schemas.microsoft.com/office/word/2024/wordml/sdtformatlock" xmlns:w16se="http://schemas.microsoft.com/office/word/2015/wordml/symex" xmlns:wpg="http://schemas.microsoft.com/office/word/2010/wordprocessingGroup" xmlns:wpi="http://schemas.microsoft.com/office/word/2010/wordprocessingInk" xmlns:wne="http://schemas.microsoft.com/office/word/2006/wordml" xmlns:wps="http://schemas.microsoft.com/office/word/2010/wordprocessingShape" mc:Ignorable="w14 w15 w16se w16cid w16 w16cex w16sdtdh w16sdtfl w16du wp14">
-  <w:p>
-    <w:pPr>
-      <w:jc w:val="center"/>
-      <w:rPr>
-        <w:b/>
-        <w:bCs/>
-        <w:sz w:val="24"/>
-        <w:szCs w:val="24"/>
-      </w:rPr>
-    </w:pPr>
-    <w:r>
-      <w:rPr>
-        <w:noProof/>
-      </w:rPr>
-      <w:drawing>
-        <wp:anchor distT="114300" distB="114300" distL="114300" distR="114300" simplePos="0" relativeHeight="251658240" behindDoc="0" locked="0" layoutInCell="1" hidden="0" allowOverlap="1" wp14:anchorId="293D75ED" wp14:editId="35E1BE32">
-          <wp:simplePos x="0" y="0"/>
-          <wp:positionH relativeFrom="column">
-            <wp:posOffset>-761999</wp:posOffset>
-          </wp:positionH>
-          <wp:positionV relativeFrom="paragraph">
-            <wp:posOffset>47626</wp:posOffset>
-          </wp:positionV>
-          <wp:extent cx="1800000" cy="598500"/>
-          <wp:effectExtent l="0" t="0" r="0" b="0"/>
-          <wp:wrapNone/>
-          <wp:docPr id="396518853" name="image2.png"/>
-          <wp:cNvGraphicFramePr/>
-          <a:graphic xmlns:a="http://schemas.openxmlformats.org/drawingml/2006/main">
-            <a:graphicData uri="http://schemas.openxmlformats.org/drawingml/2006/picture">
-              <pic:pic xmlns:pic="http://schemas.openxmlformats.org/drawingml/2006/picture">
-                <pic:nvPicPr>
-                  <pic:cNvPr id="0" name="image2.png"/>
-                  <pic:cNvPicPr preferRelativeResize="0"/>
-                </pic:nvPicPr>
-                <pic:blipFill>
-                  <a:blip r:embed="rId1"/>
-                  <a:srcRect/>
-                  <a:stretch>
-                    <a:fillRect/>
-                  </a:stretch>
-                </pic:blipFill>
-                <pic:spPr>
-                  <a:xfrm>
-                    <a:off x="0" y="0"/>
-                    <a:ext cx="1800000" cy="598500"/>
-                  </a:xfrm>
-                  <a:prstGeom prst="rect">
-                    <a:avLst/>
-                  </a:prstGeom>
-                  <a:ln/>
-                </pic:spPr>
-              </pic:pic>
-            </a:graphicData>
-          </a:graphic>
-        </wp:anchor>
-      </w:drawing>
-    </w:r>
-  </w:p>
-  <w:p>
-    <w:pPr>
-      <w:jc w:val="center"/>
-      <w:rPr>
-        <w:rFonts w:ascii="Google Sans" w:hAnsi="Google Sans" w:cs="Google Sans"/>
-        <w:b/>
-        <w:bCs/>
-        <w:sz w:val="26"/>
-        <w:szCs w:val="26"/>
-      </w:rPr>
-    </w:pPr>
-    <w:r>
-      <w:rPr>
-        <w:rFonts w:ascii="Google Sans" w:hAnsi="Google Sans" w:cs="Google Sans"/>
-        <w:b/>
-        <w:bCs/>
-        <w:sz w:val="26"/>
-        <w:szCs w:val="26"/>
-      </w:rPr>
-      <w:t>G.</w:t>
-    </w:r>
-    <w:r>
-      <w:rPr>
-        <w:rFonts w:ascii="Google Sans" w:hAnsi="Google Sans" w:cs="Google Sans"/>
-        <w:b/>
-        <w:bCs/>
-        <w:sz w:val="26"/>
-        <w:szCs w:val="26"/>
-      </w:rPr>
-      <w:t>TN.2</w:t>
-    </w:r>
-    <w:r>
-      <w:rPr>
-        <w:rFonts w:ascii="Google Sans" w:hAnsi="Google Sans" w:cs="Google Sans"/>
-        <w:b/>
-        <w:bCs/>
-        <w:sz w:val="26"/>
-        <w:szCs w:val="26"/>
-      </w:rPr>
-      <w:t>0</w:t>
-    </w:r>
-    <w:r>
-      <w:rPr>
-        <w:rFonts w:ascii="Google Sans" w:hAnsi="Google Sans" w:cs="Google Sans"/>
-        <w:b/>
-        <w:bCs/>
-        <w:sz w:val="26"/>
-        <w:szCs w:val="26"/>
-      </w:rPr>
-      <w:t xml:space="preserve">.00 </w:t>
-    </w:r>
-    <w:r>
-      <w:rPr>
-        <w:rFonts w:ascii="Google Sans" w:hAnsi="Google Sans" w:cs="Google Sans"/>
-        <w:b/>
-        <w:bCs/>
-        <w:sz w:val="26"/>
-        <w:szCs w:val="26"/>
-      </w:rPr>
-      <w:t>GÖKAY SELÜLOZİK EXTRA TİNER</w:t>
-    </w:r>
-  </w:p>
-  <w:p>
-    <w:pPr>
-      <w:jc w:val="right"/>
-      <w:rPr>
-        <w:sz w:val="16"/>
-        <w:szCs w:val="16"/>
-      </w:rPr>
-    </w:pPr>
-  </w:p>
-  <w:p>
-    <w:pPr>
-      <w:jc w:val="right"/>
-      <w:rPr>
-        <w:sz w:val="16"/>
-        <w:szCs w:val="16"/>
-      </w:rPr>
-    </w:pPr>
-  </w:p>
-  <w:p>
-    <w:pPr>
-      <w:jc w:val="right"/>
-      <w:rPr>
-        <w:sz w:val="16"/>
-        <w:szCs w:val="16"/>
-      </w:rPr>
-    </w:pPr>
-    <w:r>
-      <w:rPr>
-        <w:noProof/>
-      </w:rPr>
-      <mc:AlternateContent>
-        <mc:Choice Requires="wps">
-          <w:drawing>
-            <wp:anchor distT="0" distB="0" distL="114300" distR="114300" simplePos="0" relativeHeight="251664384" behindDoc="0" locked="0" layoutInCell="1" allowOverlap="1" wp14:anchorId="44CE4E36" wp14:editId="6945BBB5">
-              <wp:simplePos x="0" y="0"/>
-              <wp:positionH relativeFrom="column">
-                <wp:posOffset>-876300</wp:posOffset>
-              </wp:positionH>
-              <wp:positionV relativeFrom="paragraph">
-                <wp:posOffset>199390</wp:posOffset>
-              </wp:positionV>
-              <wp:extent cx="7686675" cy="0"/>
-              <wp:effectExtent l="38100" t="38100" r="66675" b="95250"/>
-              <wp:wrapNone/>
-              <wp:docPr id="1088874798" name="Düz Bağlayıcı 1"/>
-              <wp:cNvGraphicFramePr/>
-              <a:graphic xmlns:a="http://schemas.openxmlformats.org/drawingml/2006/main">
-                <a:graphicData uri="http://schemas.microsoft.com/office/word/2010/wordprocessingShape">
-                  <wps:wsp>
-                    <wps:cNvCnPr/>
-                    <wps:spPr>
-                      <a:xfrm>
-                        <a:off x="0" y="0"/>
-                        <a:ext cx="7686675" cy="0"/>
-                      </a:xfrm>
-                      <a:prstGeom prst="line">
-                        <a:avLst/>
-                      </a:prstGeom>
-                    </wps:spPr>
-                    <wps:style>
-                      <a:lnRef idx="2">
-                        <a:schemeClr val="accent1"/>
-                      </a:lnRef>
-                      <a:fillRef idx="0">
-                        <a:schemeClr val="accent1"/>
-                      </a:fillRef>
-                      <a:effectRef idx="1">
-                        <a:schemeClr val="accent1"/>
-                      </a:effectRef>
-                      <a:fontRef idx="minor">
-                        <a:schemeClr val="tx1"/>
-                      </a:fontRef>
-                    </wps:style>
-                    <wps:bodyPr/>
-                  </wps:wsp>
-                </a:graphicData>
-              </a:graphic>
-            </wp:anchor>
-          </w:drawing>
-        </mc:Choice>
-        <mc:Fallback>
-          <w:pict>
-            <v:line w14:anchorId="1DBC80B6" id="Düz Bağlayıcı 1" o:spid="_x0000_s1026" style="position:absolute;z-index:251664384;visibility:visible;mso-wrap-style:square;mso-wrap-distance-left:9pt;mso-wrap-distance-top:0;mso-wrap-distance-right:9pt;mso-wrap-distance-bottom:0;mso-position-horizontal:absolute;mso-position-horizontal-relative:text;mso-position-vertical:absolute;mso-position-vertical-relative:text" from="-69pt,15.7pt" to="536.25pt,15.7pt" o:gfxdata="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" strokecolor="#4f81bd [3204]" strokeweight="2pt">
-              <v:shadow on="t" color="black" opacity="24903f" origin=",.5" offset="0,.55556mm"/>
-            </v:line>
-          </w:pict>
-        </mc:Fallback>
-      </mc:AlternateContent>
-    </w:r>
-    <w:r>
-      <w:rPr>
-        <w:sz w:val="16"/>
-        <w:szCs w:val="16"/>
-      </w:rPr>
-      <w:t xml:space="preserve">Page </w:t>
-    </w:r>
-    <w:r>
-      <w:rPr>
-        <w:sz w:val="16"/>
-        <w:szCs w:val="16"/>
-      </w:rPr>
-      <w:fldChar w:fldCharType="begin"/>
-    </w:r>
-    <w:r>
-      <w:rPr>
-        <w:sz w:val="16"/>
-        <w:szCs w:val="16"/>
-      </w:rPr>
-      <w:instrText>PAGE</w:instrText>
-    </w:r>
-    <w:r>
-      <w:rPr>
-        <w:sz w:val="16"/>
-        <w:szCs w:val="16"/>
-      </w:rPr>
-      <w:fldChar w:fldCharType="separate"/>
-    </w:r>
-    <w:r>
-      <w:rPr>
-        <w:noProof/>
-        <w:sz w:val="16"/>
-        <w:szCs w:val="16"/>
-      </w:rPr>
-      <w:t>2</w:t>
-    </w:r>
-    <w:r>
-      <w:rPr>
-        <w:sz w:val="16"/>
-        <w:szCs w:val="16"/>
-      </w:rPr>
-      <w:fldChar w:fldCharType="end"/>
-    </w:r>
-  </w:p>
-</w:hdr>
-</file>
-
-<file path=word/header2.xml><?xml version="1.0" encoding="utf-8"?>
-<w:hdr xmlns:wpc="http://schemas.microsoft.com/office/word/2010/wordprocessingCanvas" xmlns:cx="http://schemas.microsoft.com/office/drawing/2014/chartex" xmlns:cx1="http://schemas.microsoft.com/office/drawing/2015/9/8/chartex" xmlns:cx2="http://schemas.microsoft.com/office/drawing/2015/10/21/chartex" xmlns:cx3="http://schemas.microsoft.com/office/drawing/2016/5/9/chartex" xmlns:cx4="http://schemas.microsoft.com/office/drawing/2016/5/10/chartex" xmlns:cx5="http://schemas.microsoft.com/office/drawing/2016/5/11/chartex" xmlns:cx6="http://schemas.microsoft.com/office/drawing/2016/5/12/chartex" xmlns:cx7="http://schemas.microsoft.com/office/drawing/2016/5/13/chartex" xmlns:cx8="http://schemas.microsoft.com/office/drawing/2016/5/14/chartex" xmlns:mc="http://schemas.openxmlformats.org/markup-compatibility/2006" xmlns:aink="http://schemas.microsoft.com/office/drawing/2016/ink" xmlns:am3d="http://schemas.microsoft.com/office/drawing/2017/model3d" xmlns:o="urn:schemas-microsoft-com:office:office" xmlns:oel="http://schemas.microsoft.com/office/2019/extlst" xmlns:r="http://schemas.openxmlformats.org/officeDocument/2006/relationships" xmlns:m="http://schemas.openxmlformats.org/officeDocument/2006/math" xmlns:v="urn:schemas-microsoft-com:vml" xmlns:wp14="http://schemas.microsoft.com/office/word/2010/wordprocessingDrawing" xmlns:wp="http://schemas.openxmlformats.org/drawingml/2006/wordprocessingDrawing" xmlns:w10="urn:schemas-microsoft-com:office:word" xmlns:w="http://schemas.openxmlformats.org/wordprocessingml/2006/main" xmlns:w14="http://schemas.microsoft.com/office/word/2010/wordml" xmlns:w15="http://schemas.microsoft.com/office/word/2012/wordml" xmlns:w16cei="http://schemas.microsoft.com/office/word/2026/wordml/cei" xmlns:w16cex="http://schemas.microsoft.com/office/word/2018/wordml/cex" xmlns:w16cid="http://schemas.microsoft.com/office/word/2016/wordml/cid" xmlns:w16="http://schemas.microsoft.com/office/word/2018/wordml" xmlns:w16du="http://schemas.microsoft.com/office/word/2023/wordml/word16du" xmlns:w16sdtdh="http://schemas.microsoft.com/office/word/2020/wordml/sdtdatahash" xmlns:w16sdtfl="http://schemas.microsoft.com/office/word/2024/wordml/sdtformatlock" xmlns:w16se="http://schemas.microsoft.com/office/word/2015/wordml/symex" xmlns:wpg="http://schemas.microsoft.com/office/word/2010/wordprocessingGroup" xmlns:wpi="http://schemas.microsoft.com/office/word/2010/wordprocessingInk" xmlns:wne="http://schemas.microsoft.com/office/word/2006/wordml" xmlns:wps="http://schemas.microsoft.com/office/word/2010/wordprocessingShape" mc:Ignorable="w14 w15 w16se w16cid w16 w16cex w16sdtdh w16sdtfl w16du wp14">
-  <w:p>
-    <w:pPr>
-      <w:rPr>
-        <w:rFonts w:ascii="Google Sans" w:hAnsi="Google Sans" w:cs="Google Sans"/>
-        <w:lang w:val="tr-TR"/>
-      </w:rPr>
-    </w:pPr>
-    <w:r>
-      <w:rPr>
-        <w:rFonts w:ascii="Google Sans" w:hAnsi="Google Sans" w:cs="Google Sans"/>
-        <w:lang w:val="tr-TR"/>
-      </w:rPr>
-      <mc:AlternateContent>
-        <mc:Choice Requires="wps">
-          <w:drawing>
-            <wp:anchor distT="0" distB="0" distL="114300" distR="114300" simplePos="0" relativeHeight="251662336" behindDoc="0" locked="0" layoutInCell="1" allowOverlap="1" wp14:anchorId="32279FF1" wp14:editId="421074AE">
-              <wp:simplePos x="0" y="0"/>
-              <wp:positionH relativeFrom="column">
-                <wp:posOffset>-876300</wp:posOffset>
-              </wp:positionH>
-              <wp:positionV relativeFrom="paragraph">
-                <wp:posOffset>838200</wp:posOffset>
-              </wp:positionV>
-              <wp:extent cx="7686675" cy="0"/>
-              <wp:effectExtent l="38100" t="38100" r="66675" b="95250"/>
-              <wp:wrapNone/>
-              <wp:docPr id="1754423488" name="Düz Bağlayıcı 1"/>
-              <wp:cNvGraphicFramePr/>
-              <a:graphic xmlns:a="http://schemas.openxmlformats.org/drawingml/2006/main">
-                <a:graphicData uri="http://schemas.microsoft.com/office/word/2010/wordprocessingShape">
-                  <wps:wsp>
-                    <wps:cNvCnPr/>
-                    <wps:spPr>
-                      <a:xfrm>
-                        <a:off x="0" y="0"/>
-                        <a:ext cx="7686675" cy="0"/>
-                      </a:xfrm>
-                      <a:prstGeom prst="line">
-                        <a:avLst/>
-                      </a:prstGeom>
-                    </wps:spPr>
-                    <wps:style>
-                      <a:lnRef idx="2">
-                        <a:schemeClr val="accent1"/>
-                      </a:lnRef>
-                      <a:fillRef idx="0">
-                        <a:schemeClr val="accent1"/>
-                      </a:fillRef>
-                      <a:effectRef idx="1">
-                        <a:schemeClr val="accent1"/>
-                      </a:effectRef>
-                      <a:fontRef idx="minor">
-                        <a:schemeClr val="tx1"/>
-                      </a:fontRef>
-                    </wps:style>
-                    <wps:bodyPr/>
-                  </wps:wsp>
-                </a:graphicData>
-              </a:graphic>
-            </wp:anchor>
-          </w:drawing>
-        </mc:Choice>
-        <mc:Fallback>
-          <w:pict>
-            <v:line w14:anchorId="5B211874" id="Düz Bağlayıcı 1" o:spid="_x0000_s1026" style="position:absolute;z-index:251662336;visibility:visible;mso-wrap-style:square;mso-wrap-distance-left:9pt;mso-wrap-distance-top:0;mso-wrap-distance-right:9pt;mso-wrap-distance-bottom:0;mso-position-horizontal:absolute;mso-position-horizontal-relative:text;mso-position-vertical:absolute;mso-position-vertical-relative:text" from="-69pt,66pt" to="536.25pt,66pt" o:gfxdata="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" strokecolor="#4f81bd [3204]" strokeweight="2pt">
-              <v:shadow on="t" color="black" opacity="24903f" origin=",.5" offset="0,.55556mm"/>
-            </v:line>
-          </w:pict>
-        </mc:Fallback>
-      </mc:AlternateContent>
-    </w:r>
-    <w:r>
-      <w:rPr>
-        <w:rFonts w:ascii="Google Sans" w:hAnsi="Google Sans" w:cs="Google Sans"/>
-        <w:lang w:val="tr-TR"/>
-      </w:rPr>
-      <w:drawing>
-        <wp:anchor distT="114300" distB="114300" distL="114300" distR="114300" simplePos="0" relativeHeight="251659264" behindDoc="0" locked="0" layoutInCell="1" hidden="0" allowOverlap="1" wp14:anchorId="304A4760" wp14:editId="26F295C8">
-          <wp:simplePos x="0" y="0"/>
-          <wp:positionH relativeFrom="column">
-            <wp:posOffset>-761999</wp:posOffset>
-          </wp:positionH>
-          <wp:positionV relativeFrom="paragraph">
-            <wp:posOffset>209550</wp:posOffset>
-          </wp:positionV>
-          <wp:extent cx="1800000" cy="598500"/>
-          <wp:effectExtent l="0" t="0" r="0" b="0"/>
-          <wp:wrapNone/>
-          <wp:docPr id="1737515345" name="image2.png"/>
-          <wp:cNvGraphicFramePr/>
-          <a:graphic xmlns:a="http://schemas.openxmlformats.org/drawingml/2006/main">
-            <a:graphicData uri="http://schemas.openxmlformats.org/drawingml/2006/picture">
-              <pic:pic xmlns:pic="http://schemas.openxmlformats.org/drawingml/2006/picture">
-                <pic:nvPicPr>
-                  <pic:cNvPr id="0" name="image2.png"/>
-                  <pic:cNvPicPr preferRelativeResize="0"/>
-                </pic:nvPicPr>
-                <pic:blipFill>
-                  <a:blip r:embed="rId1"/>
-                  <a:srcRect/>
-                  <a:stretch>
-                    <a:fillRect/>
-                  </a:stretch>
-                </pic:blipFill>
-                <pic:spPr>
-                  <a:xfrm>
-                    <a:off x="0" y="0"/>
-                    <a:ext cx="1800000" cy="598500"/>
-                  </a:xfrm>
-                  <a:prstGeom prst="rect">
-                    <a:avLst/>
-                  </a:prstGeom>
-                  <a:ln/>
-                </pic:spPr>
-              </pic:pic>
-            </a:graphicData>
-          </a:graphic>
-        </wp:anchor>
-      </w:drawing>
-    </w:r>
-  </w:p>
+<w:hdr xmlns:w="http://schemas.openxmlformats.org/wordprocessingml/2006/main" xmlns:r="http://schemas.openxmlformats.org/officeDocument/2006/relationships" xmlns:wp="http://schemas.openxmlformats.org/drawingml/2006/wordprocessingDrawing" xmlns:a="http://schemas.openxmlformats.org/drawingml/2006/main" xmlns:pic="http://schemas.openxmlformats.org/drawingml/2006/picture">
   <w:tbl>
     <w:tblPr>
-      <w:tblStyle w:val="a1"/>
-      <w:tblW w:w="11805" w:type="dxa"/>
-      <w:tblInd w:w="-1290" w:type="dxa"/>
+      <w:tblW w:w="5000" w:type="pct"/>
+      <w:jc w:val="center"/>
       <w:tblBorders>
-        <w:top w:val="single" w:sz="8" w:space="0" w:color="FFFFFF"/>
-        <w:left w:val="single" w:sz="8" w:space="0" w:color="FFFFFF"/>
-        <w:bottom w:val="single" w:sz="8" w:space="0" w:color="FFFFFF"/>
-        <w:right w:val="single" w:sz="8" w:space="0" w:color="FFFFFF"/>
-        <w:insideH w:val="single" w:sz="8" w:space="0" w:color="FFFFFF"/>
-        <w:insideV w:val="single" w:sz="8" w:space="0" w:color="FFFFFF"/>
+        <w:top w:val="none"/>
+        <w:left w:val="none"/>
+        <w:bottom w:val="single" w:sz="10" w:space="0" w:color="000000"/>
+        <w:right w:val="none"/>
+        <w:insideH w:val="none"/>
+        <w:insideV w:val="none"/>
       </w:tblBorders>
-      <w:tblLayout w:type="fixed"/>
-      <w:tblLook w:val="0600" w:firstRow="0" w:lastRow="0" w:firstColumn="0" w:lastColumn="0" w:noHBand="1" w:noVBand="1"/>
+      <w:tblCellMar>
+        <w:top w:w="40" w:type="dxa"/>
+        <w:bottom w:w="60" w:type="dxa"/>
+        <w:left w:w="40" w:type="dxa"/>
+        <w:right w:w="40" w:type="dxa"/>
+      </w:tblCellMar>
     </w:tblPr>
     <w:tblGrid>
-      <w:gridCol w:w="3045"/>
-      <w:gridCol w:w="6480"/>
-      <w:gridCol w:w="1245"/>
-      <w:gridCol w:w="1035"/>
+      <w:gridCol w:w="2256"/>
+      <w:gridCol w:w="4514"/>
+      <w:gridCol w:w="2256"/>
     </w:tblGrid>
     <w:tr>
+      <w:trPr>
+        <w:cantSplit/>
+      </w:trPr>
       <w:tc>
         <w:tcPr>
-          <w:tcW w:w="3045" w:type="dxa"/>
-          <w:vMerge w:val="restart"/>
-          <w:tcMar>
-            <w:top w:w="100" w:type="dxa"/>
-            <w:left w:w="100" w:type="dxa"/>
-            <w:bottom w:w="100" w:type="dxa"/>
-            <w:right w:w="100" w:type="dxa"/>
-          </w:tcMar>
+          <w:tcW w:w="1250" w:type="pct"/>
+          <w:vAlign w:val="center"/>
         </w:tcPr>
         <w:p>
           <w:pPr>
-            <w:rPr>
-              <w:rFonts w:ascii="Google Sans" w:hAnsi="Google Sans" w:cs="Google Sans"/>
-              <w:lang w:val="tr-TR"/>
-            </w:rPr>
+            <w:jc w:val="left"/>
+            <w:spacing w:before="0" w:after="0"/>
           </w:pPr>
+          <w:r>
+            <w:drawing>
+              <wp:inline distT="0" distB="0" distL="0" distR="0">
+                <wp:extent cx="1371600" cy="457200"/>
+                <wp:effectExtent l="0" t="0" r="0" b="0"/>
+                <wp:docPr id="1" name="Logo"/>
+                <wp:cNvGraphicFramePr>
+                  <a:graphicFrameLocks noChangeAspect="1"/>
+                </wp:cNvGraphicFramePr>
+                <a:graphic>
+                  <a:graphicData uri="http://schemas.openxmlformats.org/drawingml/2006/picture">
+                    <pic:pic>
+                      <pic:nvPicPr>
+                        <pic:cNvPr id="1" name="image1.png"/>
+                        <pic:cNvPicPr>
+                          <a:picLocks noChangeAspect="1"/>
+                        </pic:cNvPicPr>
+                      </pic:nvPicPr>
+                      <pic:blipFill>
+                        <a:blip r:embed="rId1"/>
+                        <a:stretch>
+                          <a:fillRect/>
+                        </a:stretch>
+                      </pic:blipFill>
+                      <pic:spPr>
+                        <a:xfrm>
+                          <a:off x="0" y="0"/>
+                          <a:ext cx="1371600" cy="457200"/>
+                        </a:xfrm>
+                        <a:prstGeom prst="rect">
+                          <a:avLst/>
+                        </a:prstGeom>
+                      </pic:spPr>
+                    </pic:pic>
+                  </a:graphicData>
+                </a:graphic>
+              </wp:inline>
+            </w:drawing>
+          </w:r>
         </w:p>
       </w:tc>
       <w:tc>
         <w:tcPr>
-          <w:tcW w:w="6480" w:type="dxa"/>
-          <w:vMerge w:val="restart"/>
-          <w:tcMar>
-            <w:top w:w="100" w:type="dxa"/>
-            <w:left w:w="100" w:type="dxa"/>
-            <w:bottom w:w="100" w:type="dxa"/>
-            <w:right w:w="100" w:type="dxa"/>
-          </w:tcMar>
+          <w:tcW w:w="2500" w:type="pct"/>
+          <w:vAlign w:val="center"/>
         </w:tcPr>
         <w:p>
           <w:pPr>
             <w:jc w:val="center"/>
-            <w:rPr>
-              <w:rFonts w:ascii="Google Sans" w:hAnsi="Google Sans" w:cs="Google Sans"/>
-              <w:b/>
-              <w:bCs/>
-              <w:sz w:val="26"/>
-              <w:szCs w:val="26"/>
-              <w:lang w:val="tr-TR"/>
-            </w:rPr>
+            <w:spacing w:before="0" w:after="20"/>
           </w:pPr>
           <w:r>
             <w:rPr>
               <w:rFonts w:ascii="Google Sans" w:hAnsi="Google Sans" w:cs="Google Sans"/>
               <w:b/>
-              <w:bCs/>
-              <w:sz w:val="26"/>
-              <w:szCs w:val="26"/>
-              <w:lang w:val="tr-TR"/>
+              <w:sz w:val="24"/>
+              <w:szCs w:val="24"/>
+              <w:color w:val="000000"/>
             </w:rPr>
             <w:t>GÜVENLİK BİLGİ FORMU</w:t>
           </w:r>
@@ -1388,411 +1030,107 @@
         <w:p>
           <w:pPr>
             <w:jc w:val="center"/>
+            <w:spacing w:before="0" w:after="0" w:line="200" w:lineRule="auto"/>
+          </w:pPr>
+          <w:r>
             <w:rPr>
               <w:rFonts w:ascii="Google Sans" w:hAnsi="Google Sans" w:cs="Google Sans"/>
-              <w:b/>
-              <w:bCs/>
-              <w:sz w:val="20"/>
-              <w:szCs w:val="20"/>
-              <w:lang w:val="tr-TR"/>
+              <w:sz w:val="14"/>
+              <w:szCs w:val="14"/>
+              <w:color w:val="333333"/>
             </w:rPr>
+            <w:t>Bu belge, 23 Haziran 2017 tarihli ve 30105 sayılı Resmi Gazete’de yayımlanan Kimyasalların Kaydı, Değerlendirilmesi, İzni ve Kısıtlanmasına İlişkin Yönetmelik (KKDİK) uyarınca hazırlanmıştır.</w:t>
+          </w:r>
+        </w:p>
+      </w:tc>
+      <w:tc>
+        <w:tcPr>
+          <w:tcW w:w="1250" w:type="pct"/>
+          <w:vAlign w:val="center"/>
+          <w:tcBorders>
+            <w:top w:val="single" w:sz="5" w:space="0" w:color="333333"/>
+            <w:left w:val="single" w:sz="5" w:space="0" w:color="333333"/>
+            <w:bottom w:val="single" w:sz="5" w:space="0" w:color="333333"/>
+            <w:right w:val="single" w:sz="5" w:space="0" w:color="333333"/>
+          </w:tcBorders>
+          <w:tcMar>
+            <w:top w:w="40" w:type="dxa"/>
+            <w:bottom w:w="40" w:type="dxa"/>
+            <w:left w:w="80" w:type="dxa"/>
+            <w:right w:w="80" w:type="dxa"/>
+          </w:tcMar>
+        </w:tcPr>
+        <w:p>
+          <w:pPr>
+            <w:jc w:val="right"/>
+            <w:spacing w:before="0" w:after="20" w:line="200" w:lineRule="auto"/>
           </w:pPr>
           <w:r>
             <w:rPr>
               <w:rFonts w:ascii="Google Sans" w:hAnsi="Google Sans" w:cs="Google Sans"/>
               <w:b/>
-              <w:bCs/>
-              <w:sz w:val="12"/>
-              <w:szCs w:val="12"/>
-              <w:lang w:val="tr-TR"/>
+              <w:sz w:val="15"/>
+              <w:szCs w:val="15"/>
+              <w:color w:val="000000"/>
             </w:rPr>
-            <w:t xml:space="preserve">Bu belge, 23 Haziran 2017 tarihli ve 30105 sayılı </w:t>
+            <w:t xml:space="preserve">Hazırlama Tarihi: </w:t>
           </w:r>
-          <w:proofErr w:type="gramStart"/>
+          <w:r>
+            <w:rPr>
+              <w:rFonts w:ascii="Google Sans" w:hAnsi="Google Sans" w:cs="Google Sans"/>
+              <w:sz w:val="15"/>
+              <w:szCs w:val="15"/>
+              <w:color w:val="333333"/>
+            </w:rPr>
+            <w:t>16.03.2019</w:t>
+          </w:r>
+        </w:p>
+        <w:p>
+          <w:pPr>
+            <w:jc w:val="right"/>
+            <w:spacing w:before="0" w:after="20" w:line="200" w:lineRule="auto"/>
+          </w:pPr>
           <w:r>
             <w:rPr>
               <w:rFonts w:ascii="Google Sans" w:hAnsi="Google Sans" w:cs="Google Sans"/>
               <w:b/>
-              <w:bCs/>
-              <w:sz w:val="12"/>
-              <w:szCs w:val="12"/>
-              <w:lang w:val="tr-TR"/>
+              <w:sz w:val="15"/>
+              <w:szCs w:val="15"/>
+              <w:color w:val="000000"/>
             </w:rPr>
-            <w:t>Resmi</w:t>
+            <w:t xml:space="preserve">Revizyon No: </w:t>
           </w:r>
-          <w:proofErr w:type="gramEnd"/>
+          <w:r>
+            <w:rPr>
+              <w:rFonts w:ascii="Google Sans" w:hAnsi="Google Sans" w:cs="Google Sans"/>
+              <w:sz w:val="15"/>
+              <w:szCs w:val="15"/>
+              <w:color w:val="333333"/>
+            </w:rPr>
+            <w:t>01</w:t>
+          </w:r>
+        </w:p>
+        <w:p>
+          <w:pPr>
+            <w:jc w:val="right"/>
+            <w:spacing w:before="0" w:after="0" w:line="200" w:lineRule="auto"/>
+          </w:pPr>
           <w:r>
             <w:rPr>
               <w:rFonts w:ascii="Google Sans" w:hAnsi="Google Sans" w:cs="Google Sans"/>
               <w:b/>
-              <w:bCs/>
-              <w:sz w:val="12"/>
-              <w:szCs w:val="12"/>
-              <w:lang w:val="tr-TR"/>
+              <w:sz w:val="15"/>
+              <w:szCs w:val="15"/>
+              <w:color w:val="000000"/>
             </w:rPr>
-            <w:t xml:space="preserve"> Gazete’de yayımlanan Kimyasalların Kaydı, Değerlendirilmesi, İzni ve Kısıtlanmasına İlişkin Yönetmelik (KKDİK) uyarınca hazırlanmıştır.</w:t>
-          </w:r>
-        </w:p>
-      </w:tc>
-      <w:tc>
-        <w:tcPr>
-          <w:tcW w:w="1245" w:type="dxa"/>
-          <w:tcMar>
-            <w:top w:w="100" w:type="dxa"/>
-            <w:left w:w="100" w:type="dxa"/>
-            <w:bottom w:w="100" w:type="dxa"/>
-            <w:right w:w="100" w:type="dxa"/>
-          </w:tcMar>
-        </w:tcPr>
-        <w:p>
-          <w:pPr>
-            <w:jc w:val="right"/>
-            <w:rPr>
-              <w:rFonts w:ascii="Google Sans" w:hAnsi="Google Sans" w:cs="Google Sans"/>
-              <w:sz w:val="12"/>
-              <w:szCs w:val="12"/>
-              <w:lang w:val="tr-TR"/>
-            </w:rPr>
-          </w:pPr>
-          <w:r>
-            <w:rPr>
-              <w:rFonts w:ascii="Google Sans" w:hAnsi="Google Sans" w:cs="Google Sans"/>
-              <w:sz w:val="12"/>
-              <w:szCs w:val="12"/>
-              <w:lang w:val="tr-TR"/>
-            </w:rPr>
-            <w:t>Hazırlanma</w:t>
+            <w:t xml:space="preserve">Revizyon Tarihi: </w:t>
           </w:r>
           <w:r>
             <w:rPr>
               <w:rFonts w:ascii="Google Sans" w:hAnsi="Google Sans" w:cs="Google Sans"/>
-              <w:sz w:val="12"/>
-              <w:szCs w:val="12"/>
-              <w:lang w:val="tr-TR"/>
-            </w:rPr>
-            <w:t xml:space="preserve"> Tarihi:</w:t>
-          </w:r>
-        </w:p>
-      </w:tc>
-      <w:tc>
-        <w:tcPr>
-          <w:tcW w:w="1035" w:type="dxa"/>
-          <w:tcMar>
-            <w:top w:w="100" w:type="dxa"/>
-            <w:left w:w="100" w:type="dxa"/>
-            <w:bottom w:w="100" w:type="dxa"/>
-            <w:right w:w="100" w:type="dxa"/>
-          </w:tcMar>
-        </w:tcPr>
-        <w:p>
-          <w:pPr>
-            <w:ind w:right="-82"/>
-            <w:rPr>
-              <w:rFonts w:ascii="Google Sans" w:hAnsi="Google Sans" w:cs="Google Sans"/>
-              <w:sz w:val="12"/>
-              <w:szCs w:val="12"/>
-              <w:lang w:val="tr-TR"/>
-            </w:rPr>
-          </w:pPr>
-          <w:r>
-            <w:rPr>
-              <w:rFonts w:ascii="Google Sans" w:hAnsi="Google Sans" w:cs="Google Sans"/>
-              <w:sz w:val="12"/>
-              <w:szCs w:val="12"/>
-              <w:lang w:val="tr-TR"/>
-            </w:rPr>
-            <w:t>16.0</w:t>
-          </w:r>
-          <w:r>
-            <w:rPr>
-              <w:rFonts w:ascii="Google Sans" w:hAnsi="Google Sans" w:cs="Google Sans"/>
-              <w:sz w:val="12"/>
-              <w:szCs w:val="12"/>
-              <w:lang w:val="tr-TR"/>
-            </w:rPr>
-            <w:t>3</w:t>
-          </w:r>
-          <w:r>
-            <w:rPr>
-              <w:rFonts w:ascii="Google Sans" w:hAnsi="Google Sans" w:cs="Google Sans"/>
-              <w:sz w:val="12"/>
-              <w:szCs w:val="12"/>
-              <w:lang w:val="tr-TR"/>
-            </w:rPr>
-            <w:t>.20</w:t>
-          </w:r>
-          <w:r>
-            <w:rPr>
-              <w:rFonts w:ascii="Google Sans" w:hAnsi="Google Sans" w:cs="Google Sans"/>
-              <w:sz w:val="12"/>
-              <w:szCs w:val="12"/>
-              <w:lang w:val="tr-TR"/>
-            </w:rPr>
-            <w:t>19</w:t>
-          </w:r>
-        </w:p>
-      </w:tc>
-    </w:tr>
-    <w:tr>
-      <w:trPr>
-        <w:trHeight w:val="15"/>
-      </w:trPr>
-      <w:tc>
-        <w:tcPr>
-          <w:tcW w:w="3045" w:type="dxa"/>
-          <w:vMerge/>
-          <w:tcMar>
-            <w:top w:w="100" w:type="dxa"/>
-            <w:left w:w="100" w:type="dxa"/>
-            <w:bottom w:w="100" w:type="dxa"/>
-            <w:right w:w="100" w:type="dxa"/>
-          </w:tcMar>
-        </w:tcPr>
-        <w:p>
-          <w:pPr>
-            <w:rPr>
-              <w:rFonts w:ascii="Google Sans" w:hAnsi="Google Sans" w:cs="Google Sans"/>
-              <w:lang w:val="tr-TR"/>
-            </w:rPr>
-          </w:pPr>
-        </w:p>
-      </w:tc>
-      <w:tc>
-        <w:tcPr>
-          <w:tcW w:w="6480" w:type="dxa"/>
-          <w:vMerge/>
-          <w:tcMar>
-            <w:top w:w="100" w:type="dxa"/>
-            <w:left w:w="100" w:type="dxa"/>
-            <w:bottom w:w="100" w:type="dxa"/>
-            <w:right w:w="100" w:type="dxa"/>
-          </w:tcMar>
-        </w:tcPr>
-        <w:p>
-          <w:pPr>
-            <w:rPr>
-              <w:rFonts w:ascii="Google Sans" w:hAnsi="Google Sans" w:cs="Google Sans"/>
-              <w:lang w:val="tr-TR"/>
-            </w:rPr>
-          </w:pPr>
-        </w:p>
-      </w:tc>
-      <w:tc>
-        <w:tcPr>
-          <w:tcW w:w="1245" w:type="dxa"/>
-          <w:tcMar>
-            <w:top w:w="100" w:type="dxa"/>
-            <w:left w:w="100" w:type="dxa"/>
-            <w:bottom w:w="100" w:type="dxa"/>
-            <w:right w:w="100" w:type="dxa"/>
-          </w:tcMar>
-        </w:tcPr>
-        <w:p>
-          <w:pPr>
-            <w:jc w:val="right"/>
-            <w:rPr>
-              <w:rFonts w:ascii="Google Sans" w:hAnsi="Google Sans" w:cs="Google Sans"/>
-              <w:sz w:val="12"/>
-              <w:szCs w:val="12"/>
-              <w:lang w:val="tr-TR"/>
-            </w:rPr>
-          </w:pPr>
-          <w:r>
-            <w:rPr>
-              <w:rFonts w:ascii="Google Sans" w:hAnsi="Google Sans" w:cs="Google Sans"/>
-              <w:sz w:val="12"/>
-              <w:szCs w:val="12"/>
-              <w:lang w:val="tr-TR"/>
-            </w:rPr>
-            <w:t>Revi</w:t>
-          </w:r>
-          <w:r>
-            <w:rPr>
-              <w:rFonts w:ascii="Google Sans" w:hAnsi="Google Sans" w:cs="Google Sans"/>
-              <w:sz w:val="12"/>
-              <w:szCs w:val="12"/>
-              <w:lang w:val="tr-TR"/>
-            </w:rPr>
-            <w:t>zyon</w:t>
-          </w:r>
-          <w:r>
-            <w:rPr>
-              <w:rFonts w:ascii="Google Sans" w:hAnsi="Google Sans" w:cs="Google Sans"/>
-              <w:sz w:val="12"/>
-              <w:szCs w:val="12"/>
-              <w:lang w:val="tr-TR"/>
-            </w:rPr>
-            <w:t xml:space="preserve"> No:</w:t>
-          </w:r>
-        </w:p>
-      </w:tc>
-      <w:tc>
-        <w:tcPr>
-          <w:tcW w:w="1035" w:type="dxa"/>
-          <w:tcMar>
-            <w:top w:w="100" w:type="dxa"/>
-            <w:left w:w="100" w:type="dxa"/>
-            <w:bottom w:w="100" w:type="dxa"/>
-            <w:right w:w="100" w:type="dxa"/>
-          </w:tcMar>
-        </w:tcPr>
-        <w:p>
-          <w:pPr>
-            <w:rPr>
-              <w:rFonts w:ascii="Google Sans" w:hAnsi="Google Sans" w:cs="Google Sans"/>
-              <w:sz w:val="12"/>
-              <w:szCs w:val="12"/>
-              <w:lang w:val="tr-TR"/>
-            </w:rPr>
-          </w:pPr>
-          <w:r>
-            <w:rPr>
-              <w:rFonts w:ascii="Google Sans" w:hAnsi="Google Sans" w:cs="Google Sans"/>
-              <w:sz w:val="12"/>
-              <w:szCs w:val="12"/>
-              <w:lang w:val="tr-TR"/>
-            </w:rPr>
-            <w:t>01</w:t>
-          </w:r>
-        </w:p>
-      </w:tc>
-    </w:tr>
-    <w:tr>
-      <w:trPr>
-        <w:trHeight w:val="210"/>
-      </w:trPr>
-      <w:tc>
-        <w:tcPr>
-          <w:tcW w:w="3045" w:type="dxa"/>
-          <w:vMerge/>
-          <w:tcMar>
-            <w:top w:w="100" w:type="dxa"/>
-            <w:left w:w="100" w:type="dxa"/>
-            <w:bottom w:w="100" w:type="dxa"/>
-            <w:right w:w="100" w:type="dxa"/>
-          </w:tcMar>
-        </w:tcPr>
-        <w:p>
-          <w:pPr>
-            <w:rPr>
-              <w:rFonts w:ascii="Google Sans" w:hAnsi="Google Sans" w:cs="Google Sans"/>
-              <w:lang w:val="tr-TR"/>
-            </w:rPr>
-          </w:pPr>
-        </w:p>
-      </w:tc>
-      <w:tc>
-        <w:tcPr>
-          <w:tcW w:w="6480" w:type="dxa"/>
-          <w:vMerge/>
-          <w:tcMar>
-            <w:top w:w="100" w:type="dxa"/>
-            <w:left w:w="100" w:type="dxa"/>
-            <w:bottom w:w="100" w:type="dxa"/>
-            <w:right w:w="100" w:type="dxa"/>
-          </w:tcMar>
-        </w:tcPr>
-        <w:p>
-          <w:pPr>
-            <w:rPr>
-              <w:rFonts w:ascii="Google Sans" w:hAnsi="Google Sans" w:cs="Google Sans"/>
-              <w:lang w:val="tr-TR"/>
-            </w:rPr>
-          </w:pPr>
-        </w:p>
-      </w:tc>
-      <w:tc>
-        <w:tcPr>
-          <w:tcW w:w="1245" w:type="dxa"/>
-          <w:tcMar>
-            <w:top w:w="100" w:type="dxa"/>
-            <w:left w:w="100" w:type="dxa"/>
-            <w:bottom w:w="100" w:type="dxa"/>
-            <w:right w:w="100" w:type="dxa"/>
-          </w:tcMar>
-        </w:tcPr>
-        <w:p>
-          <w:pPr>
-            <w:jc w:val="right"/>
-            <w:rPr>
-              <w:rFonts w:ascii="Google Sans" w:hAnsi="Google Sans" w:cs="Google Sans"/>
-              <w:sz w:val="12"/>
-              <w:szCs w:val="12"/>
-              <w:lang w:val="tr-TR"/>
-            </w:rPr>
-          </w:pPr>
-          <w:r>
-            <w:rPr>
-              <w:rFonts w:ascii="Google Sans" w:hAnsi="Google Sans" w:cs="Google Sans"/>
-              <w:sz w:val="12"/>
-              <w:szCs w:val="12"/>
-              <w:lang w:val="tr-TR"/>
-            </w:rPr>
-            <w:t>Revi</w:t>
-          </w:r>
-          <w:r>
-            <w:rPr>
-              <w:rFonts w:ascii="Google Sans" w:hAnsi="Google Sans" w:cs="Google Sans"/>
-              <w:sz w:val="12"/>
-              <w:szCs w:val="12"/>
-              <w:lang w:val="tr-TR"/>
-            </w:rPr>
-            <w:t>zy</w:t>
-          </w:r>
-          <w:r>
-            <w:rPr>
-              <w:rFonts w:ascii="Google Sans" w:hAnsi="Google Sans" w:cs="Google Sans"/>
-              <w:sz w:val="12"/>
-              <w:szCs w:val="12"/>
-              <w:lang w:val="tr-TR"/>
-            </w:rPr>
-            <w:t xml:space="preserve">on </w:t>
-          </w:r>
-          <w:r>
-            <w:rPr>
-              <w:rFonts w:ascii="Google Sans" w:hAnsi="Google Sans" w:cs="Google Sans"/>
-              <w:sz w:val="12"/>
-              <w:szCs w:val="12"/>
-              <w:lang w:val="tr-TR"/>
-            </w:rPr>
-            <w:t>Tarihi</w:t>
-          </w:r>
-          <w:r>
-            <w:rPr>
-              <w:rFonts w:ascii="Google Sans" w:hAnsi="Google Sans" w:cs="Google Sans"/>
-              <w:sz w:val="12"/>
-              <w:szCs w:val="12"/>
-              <w:lang w:val="tr-TR"/>
-            </w:rPr>
-            <w:t>:</w:t>
-          </w:r>
-        </w:p>
-      </w:tc>
-      <w:tc>
-        <w:tcPr>
-          <w:tcW w:w="1035" w:type="dxa"/>
-          <w:tcMar>
-            <w:top w:w="100" w:type="dxa"/>
-            <w:left w:w="100" w:type="dxa"/>
-            <w:bottom w:w="100" w:type="dxa"/>
-            <w:right w:w="100" w:type="dxa"/>
-          </w:tcMar>
-        </w:tcPr>
-        <w:p>
-          <w:pPr>
-            <w:rPr>
-              <w:rFonts w:ascii="Google Sans" w:hAnsi="Google Sans" w:cs="Google Sans"/>
-              <w:sz w:val="12"/>
-              <w:szCs w:val="12"/>
-              <w:lang w:val="tr-TR"/>
-            </w:rPr>
-          </w:pPr>
-          <w:r>
-            <w:rPr>
-              <w:rFonts w:ascii="Google Sans" w:hAnsi="Google Sans" w:cs="Google Sans"/>
-              <w:sz w:val="12"/>
-              <w:szCs w:val="12"/>
-              <w:lang w:val="tr-TR"/>
+              <w:sz w:val="15"/>
+              <w:szCs w:val="15"/>
+              <w:color w:val="333333"/>
             </w:rPr>
             <w:t>24.06.2026</w:t>
           </w:r>
@@ -1802,10 +1140,228 @@
   </w:tbl>
   <w:p>
     <w:pPr>
-      <w:rPr>
-        <w:rFonts w:ascii="Google Sans" w:hAnsi="Google Sans" w:cs="Google Sans"/>
-        <w:lang w:val="tr-TR"/>
-      </w:rPr>
+      <w:spacing w:before="0" w:after="80"/>
+    </w:pPr>
+  </w:p>
+</w:hdr>
+</file>
+
+<file path=word/header2.xml><?xml version="1.0" encoding="utf-8"?>
+<w:hdr xmlns:w="http://schemas.openxmlformats.org/wordprocessingml/2006/main" xmlns:r="http://schemas.openxmlformats.org/officeDocument/2006/relationships" xmlns:wp="http://schemas.openxmlformats.org/drawingml/2006/wordprocessingDrawing" xmlns:a="http://schemas.openxmlformats.org/drawingml/2006/main" xmlns:pic="http://schemas.openxmlformats.org/drawingml/2006/picture">
+  <w:tbl>
+    <w:tblPr>
+      <w:tblW w:w="5000" w:type="pct"/>
+      <w:jc w:val="center"/>
+      <w:tblBorders>
+        <w:top w:val="none"/>
+        <w:left w:val="none"/>
+        <w:bottom w:val="single" w:sz="10" w:space="0" w:color="000000"/>
+        <w:right w:val="none"/>
+        <w:insideH w:val="none"/>
+        <w:insideV w:val="none"/>
+      </w:tblBorders>
+      <w:tblCellMar>
+        <w:top w:w="40" w:type="dxa"/>
+        <w:bottom w:w="60" w:type="dxa"/>
+        <w:left w:w="40" w:type="dxa"/>
+        <w:right w:w="40" w:type="dxa"/>
+      </w:tblCellMar>
+    </w:tblPr>
+    <w:tblGrid>
+      <w:gridCol w:w="2256"/>
+      <w:gridCol w:w="4514"/>
+      <w:gridCol w:w="2256"/>
+    </w:tblGrid>
+    <w:tr>
+      <w:trPr>
+        <w:cantSplit/>
+      </w:trPr>
+      <w:tc>
+        <w:tcPr>
+          <w:tcW w:w="1250" w:type="pct"/>
+          <w:vAlign w:val="center"/>
+        </w:tcPr>
+        <w:p>
+          <w:pPr>
+            <w:jc w:val="left"/>
+            <w:spacing w:before="0" w:after="0"/>
+          </w:pPr>
+          <w:r>
+            <w:drawing>
+              <wp:inline distT="0" distB="0" distL="0" distR="0">
+                <wp:extent cx="1371600" cy="457200"/>
+                <wp:effectExtent l="0" t="0" r="0" b="0"/>
+                <wp:docPr id="1" name="Logo"/>
+                <wp:cNvGraphicFramePr>
+                  <a:graphicFrameLocks noChangeAspect="1"/>
+                </wp:cNvGraphicFramePr>
+                <a:graphic>
+                  <a:graphicData uri="http://schemas.openxmlformats.org/drawingml/2006/picture">
+                    <pic:pic>
+                      <pic:nvPicPr>
+                        <pic:cNvPr id="1" name="image1.png"/>
+                        <pic:cNvPicPr>
+                          <a:picLocks noChangeAspect="1"/>
+                        </pic:cNvPicPr>
+                      </pic:nvPicPr>
+                      <pic:blipFill>
+                        <a:blip r:embed="rId1"/>
+                        <a:stretch>
+                          <a:fillRect/>
+                        </a:stretch>
+                      </pic:blipFill>
+                      <pic:spPr>
+                        <a:xfrm>
+                          <a:off x="0" y="0"/>
+                          <a:ext cx="1371600" cy="457200"/>
+                        </a:xfrm>
+                        <a:prstGeom prst="rect">
+                          <a:avLst/>
+                        </a:prstGeom>
+                      </pic:spPr>
+                    </pic:pic>
+                  </a:graphicData>
+                </a:graphic>
+              </wp:inline>
+            </w:drawing>
+          </w:r>
+        </w:p>
+      </w:tc>
+      <w:tc>
+        <w:tcPr>
+          <w:tcW w:w="2500" w:type="pct"/>
+          <w:vAlign w:val="center"/>
+        </w:tcPr>
+        <w:p>
+          <w:pPr>
+            <w:jc w:val="center"/>
+            <w:spacing w:before="0" w:after="20"/>
+          </w:pPr>
+          <w:r>
+            <w:rPr>
+              <w:rFonts w:ascii="Google Sans" w:hAnsi="Google Sans" w:cs="Google Sans"/>
+              <w:b/>
+              <w:sz w:val="24"/>
+              <w:szCs w:val="24"/>
+              <w:color w:val="000000"/>
+            </w:rPr>
+            <w:t>GÜVENLİK BİLGİ FORMU</w:t>
+          </w:r>
+        </w:p>
+        <w:p>
+          <w:pPr>
+            <w:jc w:val="center"/>
+            <w:spacing w:before="0" w:after="0" w:line="200" w:lineRule="auto"/>
+          </w:pPr>
+          <w:r>
+            <w:rPr>
+              <w:rFonts w:ascii="Google Sans" w:hAnsi="Google Sans" w:cs="Google Sans"/>
+              <w:sz w:val="14"/>
+              <w:szCs w:val="14"/>
+              <w:color w:val="333333"/>
+            </w:rPr>
+            <w:t>Bu belge, 23 Haziran 2017 tarihli ve 30105 sayılı Resmi Gazete’de yayımlanan Kimyasalların Kaydı, Değerlendirilmesi, İzni ve Kısıtlanmasına İlişkin Yönetmelik (KKDİK) uyarınca hazırlanmıştır.</w:t>
+          </w:r>
+        </w:p>
+      </w:tc>
+      <w:tc>
+        <w:tcPr>
+          <w:tcW w:w="1250" w:type="pct"/>
+          <w:vAlign w:val="center"/>
+          <w:tcBorders>
+            <w:top w:val="single" w:sz="5" w:space="0" w:color="333333"/>
+            <w:left w:val="single" w:sz="5" w:space="0" w:color="333333"/>
+            <w:bottom w:val="single" w:sz="5" w:space="0" w:color="333333"/>
+            <w:right w:val="single" w:sz="5" w:space="0" w:color="333333"/>
+          </w:tcBorders>
+          <w:tcMar>
+            <w:top w:w="40" w:type="dxa"/>
+            <w:bottom w:w="40" w:type="dxa"/>
+            <w:left w:w="80" w:type="dxa"/>
+            <w:right w:w="80" w:type="dxa"/>
+          </w:tcMar>
+        </w:tcPr>
+        <w:p>
+          <w:pPr>
+            <w:jc w:val="right"/>
+            <w:spacing w:before="0" w:after="20" w:line="200" w:lineRule="auto"/>
+          </w:pPr>
+          <w:r>
+            <w:rPr>
+              <w:rFonts w:ascii="Google Sans" w:hAnsi="Google Sans" w:cs="Google Sans"/>
+              <w:b/>
+              <w:sz w:val="15"/>
+              <w:szCs w:val="15"/>
+              <w:color w:val="000000"/>
+            </w:rPr>
+            <w:t xml:space="preserve">Hazırlama Tarihi: </w:t>
+          </w:r>
+          <w:r>
+            <w:rPr>
+              <w:rFonts w:ascii="Google Sans" w:hAnsi="Google Sans" w:cs="Google Sans"/>
+              <w:sz w:val="15"/>
+              <w:szCs w:val="15"/>
+              <w:color w:val="333333"/>
+            </w:rPr>
+            <w:t>16.03.2019</w:t>
+          </w:r>
+        </w:p>
+        <w:p>
+          <w:pPr>
+            <w:jc w:val="right"/>
+            <w:spacing w:before="0" w:after="20" w:line="200" w:lineRule="auto"/>
+          </w:pPr>
+          <w:r>
+            <w:rPr>
+              <w:rFonts w:ascii="Google Sans" w:hAnsi="Google Sans" w:cs="Google Sans"/>
+              <w:b/>
+              <w:sz w:val="15"/>
+              <w:szCs w:val="15"/>
+              <w:color w:val="000000"/>
+            </w:rPr>
+            <w:t xml:space="preserve">Revizyon No: </w:t>
+          </w:r>
+          <w:r>
+            <w:rPr>
+              <w:rFonts w:ascii="Google Sans" w:hAnsi="Google Sans" w:cs="Google Sans"/>
+              <w:sz w:val="15"/>
+              <w:szCs w:val="15"/>
+              <w:color w:val="333333"/>
+            </w:rPr>
+            <w:t>01</w:t>
+          </w:r>
+        </w:p>
+        <w:p>
+          <w:pPr>
+            <w:jc w:val="right"/>
+            <w:spacing w:before="0" w:after="0" w:line="200" w:lineRule="auto"/>
+          </w:pPr>
+          <w:r>
+            <w:rPr>
+              <w:rFonts w:ascii="Google Sans" w:hAnsi="Google Sans" w:cs="Google Sans"/>
+              <w:b/>
+              <w:sz w:val="15"/>
+              <w:szCs w:val="15"/>
+              <w:color w:val="000000"/>
+            </w:rPr>
+            <w:t xml:space="preserve">Revizyon Tarihi: </w:t>
+          </w:r>
+          <w:r>
+            <w:rPr>
+              <w:rFonts w:ascii="Google Sans" w:hAnsi="Google Sans" w:cs="Google Sans"/>
+              <w:sz w:val="15"/>
+              <w:szCs w:val="15"/>
+              <w:color w:val="333333"/>
+            </w:rPr>
+            <w:t>24.06.2026</w:t>
+          </w:r>
+        </w:p>
+      </w:tc>
+    </w:tr>
+  </w:tbl>
+  <w:p>
+    <w:pPr>
+      <w:spacing w:before="0" w:after="80"/>
     </w:pPr>
   </w:p>
 </w:hdr>

</xml_diff>